<commit_message>
Final commit of everything
</commit_message>
<xml_diff>
--- a/Proposal/LabSubmit_Project_Proposal.docx
+++ b/Proposal/LabSubmit_Project_Proposal.docx
@@ -84,7 +84,7 @@
           <w:color w:val="000000"/>
           <w:sz w:val="26"/>
         </w:rPr>
-        <w:t>Programming Laboratory Management &amp; Code Execution Platform</w:t>
+        <w:t xml:space="preserve">Secure Laboratory Examination, Code Execution &amp; Evaluation Platform</w:t>
       </w:r>
     </w:p>
     <w:p>
@@ -100,7 +100,7 @@
           <w:color w:val="595959"/>
           <w:sz w:val="21"/>
         </w:rPr>
-        <w:t>A proposal for institutional adoption as the department's programming lab submission, execution, and evaluation platform</w:t>
+        <w:t xml:space="preserve">A proposal for institutional adoption as the department's programming lab submission, examination, execution and evaluation platform</w:t>
       </w:r>
     </w:p>
     <w:p>
@@ -267,7 +267,7 @@
           <w:color w:val="1F3A5F"/>
           <w:sz w:val="26"/>
         </w:rPr>
-        <w:t>1. Executive Summary</w:t>
+        <w:t xml:space="preserve">1. Executive Summary</w:t>
       </w:r>
     </w:p>
     <w:p>
@@ -282,7 +282,7 @@
           <w:color w:val="000000"/>
           <w:sz w:val="22"/>
         </w:rPr>
-        <w:t>This proposal introduces LabSubmit, whose main motto is to stop students from using “Copy and Paste”. This is a full-stack web platform built to manage programming laboratory courses at CBIT — covering roll-number-based student registration, lab assignment authoring, an in-browser multi-language IDE with live code execution, anti-cheat safeguards, and structured evaluation and grading. The platform replaces the current manual, spreadsheet- and file-sharing-driven process of assigning lab tasks, collecting submissions, and recording marks with a single role-based system used by Administrators, Faculty, and Students.</w:t>
+        <w:t xml:space="preserve">This proposal introduces LabSubmit, a secure digital laboratory examination and assessment platform built for CBIT. It covers roll-number-based student registration, lab and examination authoring, an in-browser multi-language IDE with live server-side code execution, structured evaluation and grading, and Secure Exam Mode — browser-level Exam Integrity Monitoring backed by a server-authoritative exam session.</w:t>
       </w:r>
     </w:p>
     <w:p>
@@ -297,7 +297,22 @@
           <w:color w:val="000000"/>
           <w:sz w:val="22"/>
         </w:rPr>
-        <w:t>The platform has already been built and is functional end-to-end. This document outlines the problem it solves, its features and architecture, how it would be used across a semester at CBIT, and the case for adopting it as the department's official lab submission system.</w:t>
+        <w:t xml:space="preserve">LabSubmit is more than an online examination website. It replaces the current manual, spreadsheet- and file-sharing-driven process of assigning lab tasks, collecting submissions and recording marks with a single role-based system used by Administrators, Faculty and Students — and it turns a lab examination into a controlled, auditable session in which the timer, the attempt state, authorisation and the submission are held by the server rather than by the student's browser.</w:t>
+      </w:r>
+    </w:p>
+    <w:p>
+      <w:pPr>
+        <w:spacing w:before="0" w:after="160"/>
+      </w:pPr>
+      <w:r>
+        <w:rPr>
+          <w:rFonts w:ascii="Carlito" w:hAnsi="Carlito"/>
+          <w:b w:val="0"/>
+          <w:i w:val="0"/>
+          <w:color w:val="000000"/>
+          <w:sz w:val="22"/>
+        </w:rPr>
+        <w:t xml:space="preserve">The platform has already been built and is functional end to end. This document sets out the problem it solves, the existing system it replaces, its features and architecture, how a semester would run on it at CBIT, what Secure Exam Mode does and — equally importantly — what it does not do, and the case for adopting it as the department's official lab examination platform.</w:t>
       </w:r>
     </w:p>
     <w:p>
@@ -312,7 +327,7 @@
           <w:color w:val="1F3A5F"/>
           <w:sz w:val="26"/>
         </w:rPr>
-        <w:t>2. Introduction &amp; Background</w:t>
+        <w:t xml:space="preserve">2. Introduction &amp; the Existing System</w:t>
       </w:r>
     </w:p>
     <w:p>
@@ -327,7 +342,7 @@
           <w:color w:val="000000"/>
           <w:sz w:val="22"/>
         </w:rPr>
-        <w:t>Programming laboratory courses at CBIT require faculty to assign coding tasks, verify that submitted code actually compiles and runs correctly, and record evaluation marks for every student across every lab session. Today, this process commonly relies on a mix of email attachments, pen drives, physical roll-call sheets for tracking, and manual compilation of student code on the lecturer's own machine — a workflow that does not scale well across sections, years, and departments, and offers no protection against copying between students during a live assessment.</w:t>
+        <w:t xml:space="preserve">Programming laboratory courses at CBIT require faculty to assign coding tasks, verify that submitted code actually compiles and runs correctly, and record evaluation marks for every student across every lab session. An increasing share of those sessions are graded examinations rather than practice exercises, which raises a second requirement the present arrangement does not meet at all: conducting the session under conditions the department can defend if a result is later questioned.</w:t>
       </w:r>
     </w:p>
     <w:p>
@@ -342,7 +357,152 @@
           <w:color w:val="000000"/>
           <w:sz w:val="22"/>
         </w:rPr>
-        <w:t>LabSubmit was designed and built to directly address these operational gaps using a modern web stack, structured specifically around how CBIT already identifies and organizes students — by 12-digit roll number, branch, year, and section — and is proposed here for evaluation as the department's lab management system.</w:t>
+        <w:t xml:space="preserve">The existing system — the arrangement LabSubmit would replace — is not a software system at all. In practice it consists of:</w:t>
+      </w:r>
+    </w:p>
+    <w:p>
+      <w:pPr>
+        <w:pStyle w:val="ListBullet"/>
+        <w:spacing w:after="80"/>
+        <w:ind w:left="425"/>
+      </w:pPr>
+      <w:r>
+        <w:rPr>
+          <w:b w:val="1"/>
+          <w:rFonts w:ascii="Carlito" w:hAnsi="Carlito"/>
+          <w:sz w:val="22"/>
+        </w:rPr>
+        <w:t xml:space="preserve">Distribution by hand</w:t>
+      </w:r>
+      <w:r>
+        <w:rPr>
+          <w:b w:val="0"/>
+          <w:rFonts w:ascii="Carlito" w:hAnsi="Carlito"/>
+          <w:sz w:val="22"/>
+        </w:rPr>
+        <w:t xml:space="preserve"> — problem statements read out, written on a board, or emailed to a section before the session begins.</w:t>
+      </w:r>
+    </w:p>
+    <w:p>
+      <w:pPr>
+        <w:pStyle w:val="ListBullet"/>
+        <w:spacing w:after="80"/>
+        <w:ind w:left="425"/>
+      </w:pPr>
+      <w:r>
+        <w:rPr>
+          <w:b w:val="1"/>
+          <w:rFonts w:ascii="Carlito" w:hAnsi="Carlito"/>
+          <w:sz w:val="22"/>
+        </w:rPr>
+        <w:t xml:space="preserve">Collection by transfer</w:t>
+      </w:r>
+      <w:r>
+        <w:rPr>
+          <w:b w:val="0"/>
+          <w:rFonts w:ascii="Carlito" w:hAnsi="Carlito"/>
+          <w:sz w:val="22"/>
+        </w:rPr>
+        <w:t xml:space="preserve"> — completed files returned on pen drives, over email, or copied to a shared folder at the end of the period.</w:t>
+      </w:r>
+    </w:p>
+    <w:p>
+      <w:pPr>
+        <w:pStyle w:val="ListBullet"/>
+        <w:spacing w:after="80"/>
+        <w:ind w:left="425"/>
+      </w:pPr>
+      <w:r>
+        <w:rPr>
+          <w:b w:val="1"/>
+          <w:rFonts w:ascii="Carlito" w:hAnsi="Carlito"/>
+          <w:sz w:val="22"/>
+        </w:rPr>
+        <w:t xml:space="preserve">Verification on the lecturer's machine</w:t>
+      </w:r>
+      <w:r>
+        <w:rPr>
+          <w:b w:val="0"/>
+          <w:rFonts w:ascii="Carlito" w:hAnsi="Carlito"/>
+          <w:sz w:val="22"/>
+        </w:rPr>
+        <w:t xml:space="preserve"> — each submission opened, compiled and run manually to check that it works.</w:t>
+      </w:r>
+    </w:p>
+    <w:p>
+      <w:pPr>
+        <w:pStyle w:val="ListBullet"/>
+        <w:spacing w:after="80"/>
+        <w:ind w:left="425"/>
+      </w:pPr>
+      <w:r>
+        <w:rPr>
+          <w:b w:val="1"/>
+          <w:rFonts w:ascii="Carlito" w:hAnsi="Carlito"/>
+          <w:sz w:val="22"/>
+        </w:rPr>
+        <w:t xml:space="preserve">Recording in a spreadsheet</w:t>
+      </w:r>
+      <w:r>
+        <w:rPr>
+          <w:b w:val="0"/>
+          <w:rFonts w:ascii="Carlito" w:hAnsi="Carlito"/>
+          <w:sz w:val="22"/>
+        </w:rPr>
+        <w:t xml:space="preserve"> — marks entered by hand, held locally, and circulated later.</w:t>
+      </w:r>
+    </w:p>
+    <w:p>
+      <w:pPr>
+        <w:pStyle w:val="ListBullet"/>
+        <w:spacing w:after="80"/>
+        <w:ind w:left="425"/>
+      </w:pPr>
+      <w:r>
+        <w:rPr>
+          <w:b w:val="1"/>
+          <w:rFonts w:ascii="Carlito" w:hAnsi="Carlito"/>
+          <w:sz w:val="22"/>
+        </w:rPr>
+        <w:t xml:space="preserve">Integrity by invigilation alone</w:t>
+      </w:r>
+      <w:r>
+        <w:rPr>
+          <w:b w:val="0"/>
+          <w:rFonts w:ascii="Carlito" w:hAnsi="Carlito"/>
+          <w:sz w:val="22"/>
+        </w:rPr>
+        <w:t xml:space="preserve"> — the only control over what a student does on the machine in front of them is a person walking the room.</w:t>
+      </w:r>
+    </w:p>
+    <w:p>
+      <w:pPr>
+        <w:spacing w:before="0" w:after="160"/>
+      </w:pPr>
+      <w:r>
+        <w:rPr>
+          <w:rFonts w:ascii="Carlito" w:hAnsi="Carlito"/>
+          <w:b w:val="0"/>
+          <w:i w:val="0"/>
+          <w:color w:val="000000"/>
+          <w:sz w:val="22"/>
+        </w:rPr>
+        <w:t xml:space="preserve">The arrangement does not scale across sections, years and departments; it produces no audit trail; and during a timed examination it offers no control over the browser, no record of suspicious activity, and no reliable enforcement of the time limit.</w:t>
+      </w:r>
+    </w:p>
+    <w:p>
+      <w:pPr>
+        <w:spacing w:before="0" w:after="160"/>
+      </w:pPr>
+      <w:r>
+        <w:rPr>
+          <w:rFonts w:ascii="Carlito" w:hAnsi="Carlito"/>
+          <w:b w:val="0"/>
+          <w:i w:val="0"/>
+          <w:color w:val="000000"/>
+          <w:sz w:val="22"/>
+        </w:rPr>
+        <w:t xml:space="preserve">LabSubmit was designed and built to close both sets of gaps using a modern web stack, structured specifically around how CBIT already identifies and organises students — by 12-digit roll number, branch, year and section — and is proposed here for evaluation as the department's laboratory examination platform.</w:t>
       </w:r>
     </w:p>
     <w:p>
@@ -357,7 +517,7 @@
           <w:color w:val="1F3A5F"/>
           <w:sz w:val="26"/>
         </w:rPr>
-        <w:t>3. Problem Statement</w:t>
+        <w:t xml:space="preserve">3. Problem Statement</w:t>
       </w:r>
     </w:p>
     <w:p>
@@ -372,7 +532,22 @@
           <w:color w:val="000000"/>
           <w:sz w:val="22"/>
         </w:rPr>
-        <w:t>The current lab assessment workflow at CBIT faces the following gaps:</w:t>
+        <w:t xml:space="preserve">The current arrangement leaves two distinct classes of gap. The first is operational and concerns how work is issued, collected and marked. The second concerns the integrity of a timed examination, and is the gap this revision of the proposal addresses directly.</w:t>
+      </w:r>
+    </w:p>
+    <w:p>
+      <w:pPr>
+        <w:spacing w:before="0" w:after="160"/>
+      </w:pPr>
+      <w:r>
+        <w:rPr>
+          <w:b w:val="1"/>
+          <w:rFonts w:ascii="Carlito" w:hAnsi="Carlito"/>
+          <w:i w:val="0"/>
+          <w:color w:val="000000"/>
+          <w:sz w:val="22"/>
+        </w:rPr>
+        <w:t xml:space="preserve">Operational gaps</w:t>
       </w:r>
     </w:p>
     <w:p>
@@ -383,18 +558,19 @@
       </w:pPr>
       <w:r>
         <w:rPr>
-          <w:rFonts w:ascii="Carlito" w:hAnsi="Carlito"/>
-          <w:b/>
+          <w:b w:val="1"/>
+          <w:rFonts w:ascii="Carlito" w:hAnsi="Carlito"/>
           <w:sz w:val="22"/>
         </w:rPr>
-        <w:t>Fragmented submission process</w:t>
-      </w:r>
-      <w:r>
-        <w:rPr>
+        <w:t xml:space="preserve">Fragmented submission process</w:t>
+      </w:r>
+      <w:r>
+        <w:rPr>
+          <w:b w:val="0"/>
           <w:rFonts w:ascii="Carlito" w:hAnsi="Carlito"/>
           <w:sz w:val="22"/>
         </w:rPr>
-        <w:t xml:space="preserve"> — no centralized system for issuing lab tasks or collecting submissions, relying instead on email or pen-drive handoffs.</w:t>
+        <w:t xml:space="preserve"> — no centralised system for issuing lab tasks or collecting submissions, relying instead on email or pen-drive handoffs.</w:t>
       </w:r>
     </w:p>
     <w:p>
@@ -405,18 +581,19 @@
       </w:pPr>
       <w:r>
         <w:rPr>
-          <w:rFonts w:ascii="Carlito" w:hAnsi="Carlito"/>
-          <w:b/>
+          <w:b w:val="1"/>
+          <w:rFonts w:ascii="Carlito" w:hAnsi="Carlito"/>
           <w:sz w:val="22"/>
         </w:rPr>
-        <w:t>No registration control</w:t>
-      </w:r>
-      <w:r>
-        <w:rPr>
+        <w:t xml:space="preserve">No registration control</w:t>
+      </w:r>
+      <w:r>
+        <w:rPr>
+          <w:b w:val="0"/>
           <w:rFonts w:ascii="Carlito" w:hAnsi="Carlito"/>
           <w:sz w:val="22"/>
         </w:rPr>
-        <w:t xml:space="preserve"> — no enforcement of authorized roll-number ranges during registration, leaving room for unauthorized or duplicate accounts.</w:t>
+        <w:t xml:space="preserve"> — no enforcement of authorised roll-number ranges during registration, leaving room for unauthorised or duplicate accounts.</w:t>
       </w:r>
     </w:p>
     <w:p>
@@ -427,14 +604,15 @@
       </w:pPr>
       <w:r>
         <w:rPr>
-          <w:rFonts w:ascii="Carlito" w:hAnsi="Carlito"/>
-          <w:b/>
+          <w:b w:val="1"/>
+          <w:rFonts w:ascii="Carlito" w:hAnsi="Carlito"/>
           <w:sz w:val="22"/>
         </w:rPr>
-        <w:t>No built-in code execution</w:t>
-      </w:r>
-      <w:r>
-        <w:rPr>
+        <w:t xml:space="preserve">No built-in code execution</w:t>
+      </w:r>
+      <w:r>
+        <w:rPr>
+          <w:b w:val="0"/>
           <w:rFonts w:ascii="Carlito" w:hAnsi="Carlito"/>
           <w:sz w:val="22"/>
         </w:rPr>
@@ -449,18 +627,19 @@
       </w:pPr>
       <w:r>
         <w:rPr>
-          <w:rFonts w:ascii="Carlito" w:hAnsi="Carlito"/>
-          <w:b/>
+          <w:b w:val="1"/>
+          <w:rFonts w:ascii="Carlito" w:hAnsi="Carlito"/>
           <w:sz w:val="22"/>
         </w:rPr>
-        <w:t>No anti-cheat protection</w:t>
-      </w:r>
-      <w:r>
-        <w:rPr>
+        <w:t xml:space="preserve">No audit trail</w:t>
+      </w:r>
+      <w:r>
+        <w:rPr>
+          <w:b w:val="0"/>
           <w:rFonts w:ascii="Carlito" w:hAnsi="Carlito"/>
           <w:sz w:val="22"/>
         </w:rPr>
-        <w:t xml:space="preserve"> — no safeguards against copy-paste or external code reuse during timed lab assessments.</w:t>
+        <w:t xml:space="preserve"> — no consistent record of submission timestamps, evaluation status or standardised feedback across sections.</w:t>
       </w:r>
     </w:p>
     <w:p>
@@ -471,18 +650,34 @@
       </w:pPr>
       <w:r>
         <w:rPr>
-          <w:rFonts w:ascii="Carlito" w:hAnsi="Carlito"/>
-          <w:b/>
+          <w:b w:val="1"/>
+          <w:rFonts w:ascii="Carlito" w:hAnsi="Carlito"/>
           <w:sz w:val="22"/>
         </w:rPr>
-        <w:t>No audit trail</w:t>
-      </w:r>
-      <w:r>
-        <w:rPr>
+        <w:t xml:space="preserve">Manual grading</w:t>
+      </w:r>
+      <w:r>
+        <w:rPr>
+          <w:b w:val="0"/>
           <w:rFonts w:ascii="Carlito" w:hAnsi="Carlito"/>
           <w:sz w:val="22"/>
         </w:rPr>
-        <w:t xml:space="preserve"> — no audit trail of submission timestamps, evaluation status, or standardized feedback across sections.</w:t>
+        <w:t xml:space="preserve"> — marks are recorded by hand in spreadsheets, prone to error, with no real-time visibility for students.</w:t>
+      </w:r>
+    </w:p>
+    <w:p>
+      <w:pPr>
+        <w:spacing w:before="0" w:after="160"/>
+      </w:pPr>
+      <w:r>
+        <w:rPr>
+          <w:b w:val="1"/>
+          <w:rFonts w:ascii="Carlito" w:hAnsi="Carlito"/>
+          <w:i w:val="0"/>
+          <w:color w:val="000000"/>
+          <w:sz w:val="22"/>
+        </w:rPr>
+        <w:t xml:space="preserve">Examination-integrity gaps</w:t>
       </w:r>
     </w:p>
     <w:p>
@@ -493,18 +688,195 @@
       </w:pPr>
       <w:r>
         <w:rPr>
-          <w:rFonts w:ascii="Carlito" w:hAnsi="Carlito"/>
-          <w:b/>
+          <w:b w:val="1"/>
+          <w:rFonts w:ascii="Carlito" w:hAnsi="Carlito"/>
           <w:sz w:val="22"/>
         </w:rPr>
-        <w:t>Manual grading</w:t>
-      </w:r>
-      <w:r>
-        <w:rPr>
+        <w:t xml:space="preserve">Tab switching</w:t>
+      </w:r>
+      <w:r>
+        <w:rPr>
+          <w:b w:val="0"/>
           <w:rFonts w:ascii="Carlito" w:hAnsi="Carlito"/>
           <w:sz w:val="22"/>
         </w:rPr>
-        <w:t xml:space="preserve"> — marks are recorded manually in spreadsheets, prone to error and with no real-time visibility for students.</w:t>
+        <w:t xml:space="preserve"> — a student can move to another browser tab or window during an examination, and nothing detects or records that it happened.</w:t>
+      </w:r>
+    </w:p>
+    <w:p>
+      <w:pPr>
+        <w:pStyle w:val="ListBullet"/>
+        <w:spacing w:after="80"/>
+        <w:ind w:left="425"/>
+      </w:pPr>
+      <w:r>
+        <w:rPr>
+          <w:b w:val="1"/>
+          <w:rFonts w:ascii="Carlito" w:hAnsi="Carlito"/>
+          <w:sz w:val="22"/>
+        </w:rPr>
+        <w:t xml:space="preserve">External resource access</w:t>
+      </w:r>
+      <w:r>
+        <w:rPr>
+          <w:b w:val="0"/>
+          <w:rFonts w:ascii="Carlito" w:hAnsi="Carlito"/>
+          <w:sz w:val="22"/>
+        </w:rPr>
+        <w:t xml:space="preserve"> — reference material, messaging applications and AI assistants are available on the same machine, one keystroke away from the examination.</w:t>
+      </w:r>
+    </w:p>
+    <w:p>
+      <w:pPr>
+        <w:pStyle w:val="ListBullet"/>
+        <w:spacing w:after="80"/>
+        <w:ind w:left="425"/>
+      </w:pPr>
+      <w:r>
+        <w:rPr>
+          <w:b w:val="1"/>
+          <w:rFonts w:ascii="Carlito" w:hAnsi="Carlito"/>
+          <w:sz w:val="22"/>
+        </w:rPr>
+        <w:t xml:space="preserve">Copy and paste</w:t>
+      </w:r>
+      <w:r>
+        <w:rPr>
+          <w:b w:val="0"/>
+          <w:rFonts w:ascii="Carlito" w:hAnsi="Carlito"/>
+          <w:sz w:val="22"/>
+        </w:rPr>
+        <w:t xml:space="preserve"> — a complete solution can be pasted in from a file, a chat window or a neighbouring machine in a single action.</w:t>
+      </w:r>
+    </w:p>
+    <w:p>
+      <w:pPr>
+        <w:pStyle w:val="ListBullet"/>
+        <w:spacing w:after="80"/>
+        <w:ind w:left="425"/>
+      </w:pPr>
+      <w:r>
+        <w:rPr>
+          <w:b w:val="1"/>
+          <w:rFonts w:ascii="Carlito" w:hAnsi="Carlito"/>
+          <w:sz w:val="22"/>
+        </w:rPr>
+        <w:t xml:space="preserve">Browser manipulation</w:t>
+      </w:r>
+      <w:r>
+        <w:rPr>
+          <w:b w:val="0"/>
+          <w:rFonts w:ascii="Carlito" w:hAnsi="Carlito"/>
+          <w:sz w:val="22"/>
+        </w:rPr>
+        <w:t xml:space="preserve"> — developer tools, the context menu and drag-and-drop transfer provide routes around whatever the page intends to allow.</w:t>
+      </w:r>
+    </w:p>
+    <w:p>
+      <w:pPr>
+        <w:pStyle w:val="ListBullet"/>
+        <w:spacing w:after="80"/>
+        <w:ind w:left="425"/>
+      </w:pPr>
+      <w:r>
+        <w:rPr>
+          <w:b w:val="1"/>
+          <w:rFonts w:ascii="Carlito" w:hAnsi="Carlito"/>
+          <w:sz w:val="22"/>
+        </w:rPr>
+        <w:t xml:space="preserve">Unreliable client-side timers</w:t>
+      </w:r>
+      <w:r>
+        <w:rPr>
+          <w:b w:val="0"/>
+          <w:rFonts w:ascii="Carlito" w:hAnsi="Carlito"/>
+          <w:sz w:val="22"/>
+        </w:rPr>
+        <w:t xml:space="preserve"> — a countdown held in the student's own browser can be paused, edited or reset by reloading the page, at which point the time limit means nothing.</w:t>
+      </w:r>
+    </w:p>
+    <w:p>
+      <w:pPr>
+        <w:pStyle w:val="ListBullet"/>
+        <w:spacing w:after="80"/>
+        <w:ind w:left="425"/>
+      </w:pPr>
+      <w:r>
+        <w:rPr>
+          <w:b w:val="1"/>
+          <w:rFonts w:ascii="Carlito" w:hAnsi="Carlito"/>
+          <w:sz w:val="22"/>
+        </w:rPr>
+        <w:t xml:space="preserve">Weak exam-session integrity</w:t>
+      </w:r>
+      <w:r>
+        <w:rPr>
+          <w:b w:val="0"/>
+          <w:rFonts w:ascii="Carlito" w:hAnsi="Carlito"/>
+          <w:sz w:val="22"/>
+        </w:rPr>
+        <w:t xml:space="preserve"> — nothing distinguishes a legitimate attempt from a second window, a stale session, or a submission replayed after the window has closed.</w:t>
+      </w:r>
+    </w:p>
+    <w:p>
+      <w:pPr>
+        <w:pStyle w:val="ListBullet"/>
+        <w:spacing w:after="80"/>
+        <w:ind w:left="425"/>
+      </w:pPr>
+      <w:r>
+        <w:rPr>
+          <w:b w:val="1"/>
+          <w:rFonts w:ascii="Carlito" w:hAnsi="Carlito"/>
+          <w:sz w:val="22"/>
+        </w:rPr>
+        <w:t xml:space="preserve">No evidence when suspicious behaviour occurs</w:t>
+      </w:r>
+      <w:r>
+        <w:rPr>
+          <w:b w:val="0"/>
+          <w:rFonts w:ascii="Carlito" w:hAnsi="Carlito"/>
+          <w:sz w:val="22"/>
+        </w:rPr>
+        <w:t xml:space="preserve"> — when something looks wrong, there is no record of what happened, when it happened or how often.</w:t>
+      </w:r>
+    </w:p>
+    <w:p>
+      <w:pPr>
+        <w:pStyle w:val="ListBullet"/>
+        <w:spacing w:after="80"/>
+        <w:ind w:left="425"/>
+      </w:pPr>
+      <w:r>
+        <w:rPr>
+          <w:b w:val="1"/>
+          <w:rFonts w:ascii="Carlito" w:hAnsi="Carlito"/>
+          <w:sz w:val="22"/>
+        </w:rPr>
+        <w:t xml:space="preserve">Difficult review for faculty</w:t>
+      </w:r>
+      <w:r>
+        <w:rPr>
+          <w:b w:val="0"/>
+          <w:rFonts w:ascii="Carlito" w:hAnsi="Carlito"/>
+          <w:sz w:val="22"/>
+        </w:rPr>
+        <w:t xml:space="preserve"> — without a per-student record, a lecturer reviewing a suspicious attempt has nothing to examine and no basis on which to act fairly.</w:t>
+      </w:r>
+    </w:p>
+    <w:p>
+      <w:pPr>
+        <w:spacing w:before="0" w:after="160"/>
+      </w:pPr>
+      <w:r>
+        <w:rPr>
+          <w:rFonts w:ascii="Carlito" w:hAnsi="Carlito"/>
+          <w:b w:val="0"/>
+          <w:i w:val="0"/>
+          <w:color w:val="000000"/>
+          <w:sz w:val="22"/>
+        </w:rPr>
+        <w:t xml:space="preserve">One boundary should be stated at the outset, because the rest of this proposal depends on it being understood. No software platform can eliminate cheating that happens in the physical world. A second computer, a mobile phone, a printed sheet or another person in the room lies outside the reach of any web application. What a platform can do is close the routes that run through the browser, make the exam session itself impossible to manipulate from the client, and leave a timestamped record whenever a browser-level route is attempted — so that invigilation is supported by evidence rather than left to rely on memory.</w:t>
       </w:r>
     </w:p>
     <w:p>
@@ -519,7 +891,7 @@
           <w:color w:val="1F3A5F"/>
           <w:sz w:val="26"/>
         </w:rPr>
-        <w:t>4. Objectives</w:t>
+        <w:t xml:space="preserve">4. Objectives</w:t>
       </w:r>
     </w:p>
     <w:p>
@@ -533,7 +905,7 @@
           <w:rFonts w:ascii="Carlito" w:hAnsi="Carlito"/>
           <w:sz w:val="22"/>
         </w:rPr>
-        <w:t>Centralize lab task creation, submission, and grading in one role-based platform.</w:t>
+        <w:t xml:space="preserve">Centralise lab task creation, examination delivery, submission and grading in one role-based platform.</w:t>
       </w:r>
     </w:p>
     <w:p>
@@ -547,7 +919,7 @@
           <w:rFonts w:ascii="Carlito" w:hAnsi="Carlito"/>
           <w:sz w:val="22"/>
         </w:rPr>
-        <w:t>Enforce controlled student registration via Admin-authorized roll-number ranges.</w:t>
+        <w:t xml:space="preserve">Enforce controlled student registration via Admin-authorised roll-number ranges.</w:t>
       </w:r>
     </w:p>
     <w:p>
@@ -561,7 +933,7 @@
           <w:rFonts w:ascii="Carlito" w:hAnsi="Carlito"/>
           <w:sz w:val="22"/>
         </w:rPr>
-        <w:t>Provide an in-browser code editor with real multi-language compilation (C, C++, Java, Python, JavaScript), removing the need for manual local verification.</w:t>
+        <w:t xml:space="preserve">Provide an in-browser code editor with real multi-language compilation on the server, removing the need for manual local verification.</w:t>
       </w:r>
     </w:p>
     <w:p>
@@ -575,7 +947,7 @@
           <w:rFonts w:ascii="Carlito" w:hAnsi="Carlito"/>
           <w:sz w:val="22"/>
         </w:rPr>
-        <w:t>Reduce opportunities for academic dishonesty during timed lab assessments through anti-cheat safeguards.</w:t>
+        <w:t xml:space="preserve">Run every examination as a server-authoritative exam session, so that the timer, the attempt state, authorisation and the submission are decided by the backend and cannot be altered from the browser.</w:t>
       </w:r>
     </w:p>
     <w:p>
@@ -589,7 +961,7 @@
           <w:rFonts w:ascii="Carlito" w:hAnsi="Carlito"/>
           <w:sz w:val="22"/>
         </w:rPr>
-        <w:t>Give faculty a structured evaluation workflow — marks, remarks, status, and the ability to reopen a workspace for correction.</w:t>
+        <w:t xml:space="preserve">Reduce the browser-level opportunities for academic dishonesty during a timed examination through Secure Exam Mode — fullscreen, focus, visibility, clipboard and context-menu monitoring and restriction.</w:t>
       </w:r>
     </w:p>
     <w:p>
@@ -603,7 +975,7 @@
           <w:rFonts w:ascii="Carlito" w:hAnsi="Carlito"/>
           <w:sz w:val="22"/>
         </w:rPr>
-        <w:t>Give students real-time, transparent access to their grades and feedback.</w:t>
+        <w:t xml:space="preserve">Record every detected integrity event with its type and a server-side timestamp, and present the sequence to faculty as reviewable evidence rather than as an automated verdict.</w:t>
       </w:r>
     </w:p>
     <w:p>
@@ -617,7 +989,49 @@
           <w:rFonts w:ascii="Carlito" w:hAnsi="Carlito"/>
           <w:sz w:val="22"/>
         </w:rPr>
-        <w:t>Give administrators system-wide visibility into submissions and grading completion across faculty.</w:t>
+        <w:t xml:space="preserve">Give faculty a structured evaluation workflow — marks, remarks, status, the integrity log for each attempt, and the ability to reopen a workspace for correction.</w:t>
+      </w:r>
+    </w:p>
+    <w:p>
+      <w:pPr>
+        <w:pStyle w:val="ListNumber"/>
+        <w:spacing w:after="80"/>
+        <w:ind w:left="425"/>
+      </w:pPr>
+      <w:r>
+        <w:rPr>
+          <w:rFonts w:ascii="Carlito" w:hAnsi="Carlito"/>
+          <w:sz w:val="22"/>
+        </w:rPr>
+        <w:t xml:space="preserve">Give students a stable, transparent examination experience: a reliable timer, clear warnings and a submission process that cannot silently fail.</w:t>
+      </w:r>
+    </w:p>
+    <w:p>
+      <w:pPr>
+        <w:pStyle w:val="ListNumber"/>
+        <w:spacing w:after="80"/>
+        <w:ind w:left="425"/>
+      </w:pPr>
+      <w:r>
+        <w:rPr>
+          <w:rFonts w:ascii="Carlito" w:hAnsi="Carlito"/>
+          <w:sz w:val="22"/>
+        </w:rPr>
+        <w:t xml:space="preserve">Give administrators system-wide visibility into submissions, grading completion and examination integrity across faculty.</w:t>
+      </w:r>
+    </w:p>
+    <w:p>
+      <w:pPr>
+        <w:pStyle w:val="ListNumber"/>
+        <w:spacing w:after="80"/>
+        <w:ind w:left="425"/>
+      </w:pPr>
+      <w:r>
+        <w:rPr>
+          <w:rFonts w:ascii="Carlito" w:hAnsi="Carlito"/>
+          <w:sz w:val="22"/>
+        </w:rPr>
+        <w:t xml:space="preserve">Be honest, in the platform and in its documentation, about the boundary between browser-level integrity monitoring and operating-system-level lockdown.</w:t>
       </w:r>
     </w:p>
     <w:p>
@@ -632,7 +1046,7 @@
           <w:color w:val="1F3A5F"/>
           <w:sz w:val="26"/>
         </w:rPr>
-        <w:t>5. Proposed System Overview</w:t>
+        <w:t xml:space="preserve">5. Proposed System Overview</w:t>
       </w:r>
     </w:p>
     <w:p>
@@ -647,7 +1061,7 @@
           <w:color w:val="000000"/>
           <w:sz w:val="22"/>
         </w:rPr>
-        <w:t>LabSubmit is a role-based web application with three access levels, each with a dedicated dashboard:</w:t>
+        <w:t xml:space="preserve">LabSubmit is a centralised laboratory examination platform with three access levels, each with a dedicated dashboard:</w:t>
       </w:r>
     </w:p>
     <w:tbl>
@@ -916,9 +1330,10 @@
           <w:color w:val="000000"/>
           <w:sz w:val="22"/>
         </w:rPr>
-        <w:t>Students register using their 12-digit CBIT roll number against Admin-approved ranges, are assigned to lecturer-managed sections, complete lab assignments in a browser-based IDE, and submit code that locks automatically to preserve submission integrity. Faculty create and grade labs within their own sections; Administrators manage faculty accounts, roll-number ranges, and institution-wide reporting.</w:t>
+        <w:t xml:space="preserve">Students register using their 12-digit CBIT roll number against Admin-approved ranges, are assigned to lecturer-managed sections, and complete lab work and examinations in a browser-based IDE. When an examination begins, the attempt is created and timed by the server, Secure Exam Mode activates in the browser, and the workspace locks automatically on submission — whether the student submits, the server deadline passes, or a faculty-set integrity threshold is crossed. Faculty author and grade examinations within their own sections, with the integrity log for each attempt beside the submission; Administrators manage faculty accounts, roll-number ranges and institution-wide reporting.</w:t>
       </w:r>
     </w:p>
+    <w:p/>
     <w:p>
       <w:pPr>
         <w:spacing w:before="280" w:after="120"/>
@@ -931,7 +1346,213 @@
           <w:color w:val="1F3A5F"/>
           <w:sz w:val="26"/>
         </w:rPr>
-        <w:t>6. Key Features</w:t>
+        <w:t xml:space="preserve">6. Innovation</w:t>
+      </w:r>
+    </w:p>
+    <w:p>
+      <w:pPr>
+        <w:spacing w:before="0" w:after="160"/>
+      </w:pPr>
+      <w:r>
+        <w:rPr>
+          <w:rFonts w:ascii="Carlito" w:hAnsi="Carlito"/>
+          <w:b w:val="0"/>
+          <w:i w:val="0"/>
+          <w:color w:val="000000"/>
+          <w:sz w:val="22"/>
+        </w:rPr>
+        <w:t xml:space="preserve">What distinguishes LabSubmit from a general-purpose learning management system, or from a quiz tool with a timer, is that the examination itself is a first-class object with its own state, its own security model and its own audit record.</w:t>
+      </w:r>
+    </w:p>
+    <w:p>
+      <w:pPr>
+        <w:pStyle w:val="ListBullet"/>
+        <w:spacing w:after="80"/>
+        <w:ind w:left="425"/>
+      </w:pPr>
+      <w:r>
+        <w:rPr>
+          <w:b w:val="1"/>
+          <w:rFonts w:ascii="Carlito" w:hAnsi="Carlito"/>
+          <w:sz w:val="22"/>
+        </w:rPr>
+        <w:t xml:space="preserve">Secure Exam Mode</w:t>
+      </w:r>
+      <w:r>
+        <w:rPr>
+          <w:b w:val="0"/>
+          <w:rFonts w:ascii="Carlito" w:hAnsi="Carlito"/>
+          <w:sz w:val="22"/>
+        </w:rPr>
+        <w:t xml:space="preserve"> — a dedicated examination mode that monitors fullscreen state, window focus and tab visibility, intercepts developer-tool shortcuts, and restricts clipboard, context-menu and drag-and-drop actions for the duration of an attempt.</w:t>
+      </w:r>
+    </w:p>
+    <w:p>
+      <w:pPr>
+        <w:pStyle w:val="ListBullet"/>
+        <w:spacing w:after="80"/>
+        <w:ind w:left="425"/>
+      </w:pPr>
+      <w:r>
+        <w:rPr>
+          <w:b w:val="1"/>
+          <w:rFonts w:ascii="Carlito" w:hAnsi="Carlito"/>
+          <w:sz w:val="22"/>
+        </w:rPr>
+        <w:t xml:space="preserve">Server-authoritative exam sessions</w:t>
+      </w:r>
+      <w:r>
+        <w:rPr>
+          <w:b w:val="0"/>
+          <w:rFonts w:ascii="Carlito" w:hAnsi="Carlito"/>
+          <w:sz w:val="22"/>
+        </w:rPr>
+        <w:t xml:space="preserve"> — the deadline, the attempt state, authorisation and the submission are computed and enforced by the backend on every protected request. The browser displays the exam; it does not decide anything about it.</w:t>
+      </w:r>
+    </w:p>
+    <w:p>
+      <w:pPr>
+        <w:pStyle w:val="ListBullet"/>
+        <w:spacing w:after="80"/>
+        <w:ind w:left="425"/>
+      </w:pPr>
+      <w:r>
+        <w:rPr>
+          <w:b w:val="1"/>
+          <w:rFonts w:ascii="Carlito" w:hAnsi="Carlito"/>
+          <w:sz w:val="22"/>
+        </w:rPr>
+        <w:t xml:space="preserve">The integrity event timeline</w:t>
+      </w:r>
+      <w:r>
+        <w:rPr>
+          <w:b w:val="0"/>
+          <w:rFonts w:ascii="Carlito" w:hAnsi="Carlito"/>
+          <w:sz w:val="22"/>
+        </w:rPr>
+        <w:t xml:space="preserve"> — each detected event is stored with its type and a server-side timestamp against the student's attempt, producing a reviewable sequence rather than a single flag.</w:t>
+      </w:r>
+    </w:p>
+    <w:p>
+      <w:pPr>
+        <w:pStyle w:val="ListBullet"/>
+        <w:spacing w:after="80"/>
+        <w:ind w:left="425"/>
+      </w:pPr>
+      <w:r>
+        <w:rPr>
+          <w:b w:val="1"/>
+          <w:rFonts w:ascii="Carlito" w:hAnsi="Carlito"/>
+          <w:sz w:val="22"/>
+        </w:rPr>
+        <w:t xml:space="preserve">A faculty review dashboard</w:t>
+      </w:r>
+      <w:r>
+        <w:rPr>
+          <w:b w:val="0"/>
+          <w:rFonts w:ascii="Carlito" w:hAnsi="Carlito"/>
+          <w:sz w:val="22"/>
+        </w:rPr>
+        <w:t xml:space="preserve"> — per-exam and per-section violation logs, per-student counts, and the event list shown beside each submission at the moment a mark is being decided.</w:t>
+      </w:r>
+    </w:p>
+    <w:p>
+      <w:pPr>
+        <w:pStyle w:val="ListBullet"/>
+        <w:spacing w:after="80"/>
+        <w:ind w:left="425"/>
+      </w:pPr>
+      <w:r>
+        <w:rPr>
+          <w:b w:val="1"/>
+          <w:rFonts w:ascii="Carlito" w:hAnsi="Carlito"/>
+          <w:sz w:val="22"/>
+        </w:rPr>
+        <w:t xml:space="preserve">Automated coding assessment</w:t>
+      </w:r>
+      <w:r>
+        <w:rPr>
+          <w:b w:val="0"/>
+          <w:rFonts w:ascii="Carlito" w:hAnsi="Carlito"/>
+          <w:sz w:val="22"/>
+        </w:rPr>
+        <w:t xml:space="preserve"> — submissions are compiled and executed on the server within the platform, so correctness is verified where the marks are recorded, not on a lecturer's laptop afterwards.</w:t>
+      </w:r>
+    </w:p>
+    <w:p>
+      <w:pPr>
+        <w:pStyle w:val="ListBullet"/>
+        <w:spacing w:after="80"/>
+        <w:ind w:left="425"/>
+      </w:pPr>
+      <w:r>
+        <w:rPr>
+          <w:b w:val="1"/>
+          <w:rFonts w:ascii="Carlito" w:hAnsi="Carlito"/>
+          <w:sz w:val="22"/>
+        </w:rPr>
+        <w:t xml:space="preserve">Randomised assessments</w:t>
+      </w:r>
+      <w:r>
+        <w:rPr>
+          <w:b w:val="0"/>
+          <w:rFonts w:ascii="Carlito" w:hAnsi="Carlito"/>
+          <w:sz w:val="22"/>
+        </w:rPr>
+        <w:t xml:space="preserve"> — proposed as a future anti-collusion capability: variant problem statements and test data distributed across a section so that neighbouring students do not receive identical work.</w:t>
+      </w:r>
+    </w:p>
+    <w:p>
+      <w:pPr>
+        <w:pStyle w:val="ListBullet"/>
+        <w:spacing w:after="80"/>
+        <w:ind w:left="425"/>
+      </w:pPr>
+      <w:r>
+        <w:rPr>
+          <w:b w:val="1"/>
+          <w:rFonts w:ascii="Carlito" w:hAnsi="Carlito"/>
+          <w:sz w:val="22"/>
+        </w:rPr>
+        <w:t xml:space="preserve">A LabSubmit Secure Exam Client</w:t>
+      </w:r>
+      <w:r>
+        <w:rPr>
+          <w:b w:val="0"/>
+          <w:rFonts w:ascii="Carlito" w:hAnsi="Carlito"/>
+          <w:sz w:val="22"/>
+        </w:rPr>
+        <w:t xml:space="preserve"> — proposed as future work, providing operating-system-level lockdown that a web application cannot. It is described in Section 18 and is not part of the platform today.</w:t>
+      </w:r>
+    </w:p>
+    <w:p>
+      <w:pPr>
+        <w:spacing w:before="0" w:after="160"/>
+      </w:pPr>
+      <w:r>
+        <w:rPr>
+          <w:rFonts w:ascii="Carlito" w:hAnsi="Carlito"/>
+          <w:b w:val="0"/>
+          <w:i w:val="0"/>
+          <w:color w:val="000000"/>
+          <w:sz w:val="22"/>
+        </w:rPr>
+        <w:t xml:space="preserve">The last two items are explicitly future work. They are listed here because the innovation the platform claims is a coherent path from browser-level integrity monitoring towards full examination lockdown — not a claim to have arrived at the end of it.</w:t>
+      </w:r>
+    </w:p>
+    <w:p>
+      <w:pPr>
+        <w:spacing w:before="280" w:after="120"/>
+      </w:pPr>
+      <w:r>
+        <w:rPr>
+          <w:rFonts w:ascii="Carlito" w:hAnsi="Carlito"/>
+          <w:b/>
+          <w:i w:val="0"/>
+          <w:color w:val="1F3A5F"/>
+          <w:sz w:val="26"/>
+        </w:rPr>
+        <w:t xml:space="preserve">7. Key Features</w:t>
       </w:r>
     </w:p>
     <w:p>
@@ -946,7 +1567,7 @@
           <w:color w:val="1F3A5F"/>
           <w:sz w:val="23"/>
         </w:rPr>
-        <w:t>6.1 Administrator</w:t>
+        <w:t xml:space="preserve">7.1 Administrator</w:t>
       </w:r>
     </w:p>
     <w:p>
@@ -1049,7 +1670,7 @@
           <w:color w:val="1F3A5F"/>
           <w:sz w:val="23"/>
         </w:rPr>
-        <w:t>6.2 Faculty Lecturer</w:t>
+        <w:t xml:space="preserve">7.2 Faculty Lecturer</w:t>
       </w:r>
     </w:p>
     <w:p>
@@ -1152,7 +1773,7 @@
           <w:color w:val="1F3A5F"/>
           <w:sz w:val="23"/>
         </w:rPr>
-        <w:t>6.3 Student</w:t>
+        <w:t xml:space="preserve">7.3 Student</w:t>
       </w:r>
     </w:p>
     <w:p>
@@ -1207,18 +1828,19 @@
       </w:pPr>
       <w:r>
         <w:rPr>
-          <w:rFonts w:ascii="Carlito" w:hAnsi="Carlito"/>
-          <w:b/>
+          <w:b w:val="1"/>
+          <w:rFonts w:ascii="Carlito" w:hAnsi="Carlito"/>
           <w:sz w:val="22"/>
         </w:rPr>
-        <w:t>Anti-cheat protection</w:t>
-      </w:r>
-      <w:r>
-        <w:rPr>
+        <w:t xml:space="preserve">Secure Exam Mode</w:t>
+      </w:r>
+      <w:r>
+        <w:rPr>
+          <w:b w:val="0"/>
           <w:rFonts w:ascii="Carlito" w:hAnsi="Carlito"/>
           <w:sz w:val="22"/>
         </w:rPr>
-        <w:t xml:space="preserve"> — blocks copy, paste, cut, right-click, keyboard shortcuts, and drag-and-drop text transfer during assessments.</w:t>
+        <w:t xml:space="preserve"> — during an examination, fullscreen, window focus and tab visibility are monitored, and copy, paste, cut, right-click and drag-and-drop are restricted according to the settings the faculty chose for that exam.</w:t>
       </w:r>
     </w:p>
     <w:p>
@@ -1229,18 +1851,19 @@
       </w:pPr>
       <w:r>
         <w:rPr>
-          <w:rFonts w:ascii="Carlito" w:hAnsi="Carlito"/>
-          <w:b/>
+          <w:b w:val="1"/>
+          <w:rFonts w:ascii="Carlito" w:hAnsi="Carlito"/>
           <w:sz w:val="22"/>
         </w:rPr>
-        <w:t>Single-submission locking</w:t>
-      </w:r>
-      <w:r>
-        <w:rPr>
+        <w:t xml:space="preserve">Server-timed session and single-submission locking</w:t>
+      </w:r>
+      <w:r>
+        <w:rPr>
+          <w:b w:val="0"/>
           <w:rFonts w:ascii="Carlito" w:hAnsi="Carlito"/>
           <w:sz w:val="22"/>
         </w:rPr>
-        <w:t xml:space="preserve"> — the workspace becomes read-only immediately after submission unless reopened by the lecturer.</w:t>
+        <w:t xml:space="preserve"> — the countdown is issued by the server; the workspace becomes read-only immediately after submission unless reopened by the lecturer.</w:t>
       </w:r>
     </w:p>
     <w:p>
@@ -1263,6 +1886,220 @@
           <w:sz w:val="22"/>
         </w:rPr>
         <w:t xml:space="preserve"> — published marks, evaluation status, and faculty remarks are visible immediately.</w:t>
+      </w:r>
+    </w:p>
+    <w:p>
+      <w:pPr>
+        <w:spacing w:before="200" w:after="100"/>
+      </w:pPr>
+      <w:r>
+        <w:rPr>
+          <w:rFonts w:ascii="Carlito" w:hAnsi="Carlito"/>
+          <w:b/>
+          <w:i w:val="0"/>
+          <w:color w:val="1F3A5F"/>
+          <w:sz w:val="23"/>
+        </w:rPr>
+        <w:t xml:space="preserve">7.4 Secure Exam Mode</w:t>
+      </w:r>
+    </w:p>
+    <w:p>
+      <w:pPr>
+        <w:spacing w:before="0" w:after="160"/>
+      </w:pPr>
+      <w:r>
+        <w:rPr>
+          <w:rFonts w:ascii="Carlito" w:hAnsi="Carlito"/>
+          <w:b w:val="0"/>
+          <w:i w:val="0"/>
+          <w:color w:val="000000"/>
+          <w:sz w:val="22"/>
+        </w:rPr>
+        <w:t xml:space="preserve">Secure Exam Mode is the examination mode of the platform, enabled per exam by the faculty who authored it. It is described in full in Section 8; in summary it provides:</w:t>
+      </w:r>
+    </w:p>
+    <w:p>
+      <w:pPr>
+        <w:pStyle w:val="ListBullet"/>
+        <w:spacing w:after="80"/>
+        <w:ind w:left="425"/>
+      </w:pPr>
+      <w:r>
+        <w:rPr>
+          <w:b w:val="1"/>
+          <w:rFonts w:ascii="Carlito" w:hAnsi="Carlito"/>
+          <w:sz w:val="22"/>
+        </w:rPr>
+        <w:t xml:space="preserve">Exam scheduling and duration</w:t>
+      </w:r>
+      <w:r>
+        <w:rPr>
+          <w:b w:val="0"/>
+          <w:rFonts w:ascii="Carlito" w:hAnsi="Carlito"/>
+          <w:sz w:val="22"/>
+        </w:rPr>
+        <w:t xml:space="preserve"> — a start time, an end time and a per-student duration, with the effective deadline derived by the server.</w:t>
+      </w:r>
+    </w:p>
+    <w:p>
+      <w:pPr>
+        <w:pStyle w:val="ListBullet"/>
+        <w:spacing w:after="80"/>
+        <w:ind w:left="425"/>
+      </w:pPr>
+      <w:r>
+        <w:rPr>
+          <w:b w:val="1"/>
+          <w:rFonts w:ascii="Carlito" w:hAnsi="Carlito"/>
+          <w:sz w:val="22"/>
+        </w:rPr>
+        <w:t xml:space="preserve">Fullscreen enforcement</w:t>
+      </w:r>
+      <w:r>
+        <w:rPr>
+          <w:b w:val="0"/>
+          <w:rFonts w:ascii="Carlito" w:hAnsi="Carlito"/>
+          <w:sz w:val="22"/>
+        </w:rPr>
+        <w:t xml:space="preserve"> — fullscreen is requested when the attempt begins; exits are detected, counted, and gated behind a blocking prompt to re-enter.</w:t>
+      </w:r>
+    </w:p>
+    <w:p>
+      <w:pPr>
+        <w:pStyle w:val="ListBullet"/>
+        <w:spacing w:after="80"/>
+        <w:ind w:left="425"/>
+      </w:pPr>
+      <w:r>
+        <w:rPr>
+          <w:b w:val="1"/>
+          <w:rFonts w:ascii="Carlito" w:hAnsi="Carlito"/>
+          <w:sz w:val="22"/>
+        </w:rPr>
+        <w:t xml:space="preserve">Focus and visibility monitoring</w:t>
+      </w:r>
+      <w:r>
+        <w:rPr>
+          <w:b w:val="0"/>
+          <w:rFonts w:ascii="Carlito" w:hAnsi="Carlito"/>
+          <w:sz w:val="22"/>
+        </w:rPr>
+        <w:t xml:space="preserve"> — loss of window focus and hiding of the tab are detected and recorded.</w:t>
+      </w:r>
+    </w:p>
+    <w:p>
+      <w:pPr>
+        <w:pStyle w:val="ListBullet"/>
+        <w:spacing w:after="80"/>
+        <w:ind w:left="425"/>
+      </w:pPr>
+      <w:r>
+        <w:rPr>
+          <w:b w:val="1"/>
+          <w:rFonts w:ascii="Carlito" w:hAnsi="Carlito"/>
+          <w:sz w:val="22"/>
+        </w:rPr>
+        <w:t xml:space="preserve">Clipboard and context-menu restriction</w:t>
+      </w:r>
+      <w:r>
+        <w:rPr>
+          <w:b w:val="0"/>
+          <w:rFonts w:ascii="Carlito" w:hAnsi="Carlito"/>
+          <w:sz w:val="22"/>
+        </w:rPr>
+        <w:t xml:space="preserve"> — copy, cut, paste, drag-and-drop, text selection and middle-click paste are blocked in the page, with per-exam overrides.</w:t>
+      </w:r>
+    </w:p>
+    <w:p>
+      <w:pPr>
+        <w:pStyle w:val="ListBullet"/>
+        <w:spacing w:after="80"/>
+        <w:ind w:left="425"/>
+      </w:pPr>
+      <w:r>
+        <w:rPr>
+          <w:b w:val="1"/>
+          <w:rFonts w:ascii="Carlito" w:hAnsi="Carlito"/>
+          <w:sz w:val="22"/>
+        </w:rPr>
+        <w:t xml:space="preserve">Developer-tool shortcut interception</w:t>
+      </w:r>
+      <w:r>
+        <w:rPr>
+          <w:b w:val="0"/>
+          <w:rFonts w:ascii="Carlito" w:hAnsi="Carlito"/>
+          <w:sz w:val="22"/>
+        </w:rPr>
+        <w:t xml:space="preserve"> — the common shortcuts are intercepted and recorded.</w:t>
+      </w:r>
+    </w:p>
+    <w:p>
+      <w:pPr>
+        <w:pStyle w:val="ListBullet"/>
+        <w:spacing w:after="80"/>
+        <w:ind w:left="425"/>
+      </w:pPr>
+      <w:r>
+        <w:rPr>
+          <w:b w:val="1"/>
+          <w:rFonts w:ascii="Carlito" w:hAnsi="Carlito"/>
+          <w:sz w:val="22"/>
+        </w:rPr>
+        <w:t xml:space="preserve">Server-authoritative timing and submission</w:t>
+      </w:r>
+      <w:r>
+        <w:rPr>
+          <w:b w:val="0"/>
+          <w:rFonts w:ascii="Carlito" w:hAnsi="Carlito"/>
+          <w:sz w:val="22"/>
+        </w:rPr>
+        <w:t xml:space="preserve"> — the deadline and the submission are owned by the backend, and an expired attempt is finalised by the server whether or not the browser reports back.</w:t>
+      </w:r>
+    </w:p>
+    <w:p>
+      <w:pPr>
+        <w:pStyle w:val="ListBullet"/>
+        <w:spacing w:after="80"/>
+        <w:ind w:left="425"/>
+      </w:pPr>
+      <w:r>
+        <w:rPr>
+          <w:b w:val="1"/>
+          <w:rFonts w:ascii="Carlito" w:hAnsi="Carlito"/>
+          <w:sz w:val="22"/>
+        </w:rPr>
+        <w:t xml:space="preserve">Integrity event logging and faculty review</w:t>
+      </w:r>
+      <w:r>
+        <w:rPr>
+          <w:b w:val="0"/>
+          <w:rFonts w:ascii="Carlito" w:hAnsi="Carlito"/>
+          <w:sz w:val="22"/>
+        </w:rPr>
+        <w:t xml:space="preserve"> — every detected event is timestamped, deduplicated and stored for review.</w:t>
+      </w:r>
+    </w:p>
+    <w:p>
+      <w:pPr>
+        <w:pStyle w:val="ListBullet"/>
+        <w:spacing w:after="80"/>
+        <w:ind w:left="425"/>
+      </w:pPr>
+      <w:r>
+        <w:rPr>
+          <w:b w:val="1"/>
+          <w:rFonts w:ascii="Carlito" w:hAnsi="Carlito"/>
+          <w:sz w:val="22"/>
+        </w:rPr>
+        <w:t xml:space="preserve">Threshold auto-submission</w:t>
+      </w:r>
+      <w:r>
+        <w:rPr>
+          <w:b w:val="0"/>
+          <w:rFonts w:ascii="Carlito" w:hAnsi="Carlito"/>
+          <w:sz w:val="22"/>
+        </w:rPr>
+        <w:t xml:space="preserve"> — crossing a faculty-set fullscreen-exit threshold submits the attempt automatically and locks the workspace.</w:t>
       </w:r>
     </w:p>
     <w:p>
@@ -1277,7 +2114,7 @@
           <w:color w:val="1F3A5F"/>
           <w:sz w:val="26"/>
         </w:rPr>
-        <w:t>7. System Architecture &amp; Technology Stack</w:t>
+        <w:t xml:space="preserve">8. Secure Exam Mode &amp; Exam Integrity Monitoring</w:t>
       </w:r>
     </w:p>
     <w:p>
@@ -1292,7 +2129,1527 @@
           <w:color w:val="000000"/>
           <w:sz w:val="22"/>
         </w:rPr>
-        <w:t>LabSubmit is built as a modern, self-hostable web application using open-source technologies throughout, with no licensing cost to the institution.</w:t>
+        <w:t xml:space="preserve">This section describes the platform's examination security model in full, including its limits. It is written so that the boundary between what LabSubmit does and what it does not do is unambiguous.</w:t>
+      </w:r>
+    </w:p>
+    <w:p>
+      <w:pPr>
+        <w:spacing w:before="200" w:after="100"/>
+      </w:pPr>
+      <w:r>
+        <w:rPr>
+          <w:rFonts w:ascii="Carlito" w:hAnsi="Carlito"/>
+          <w:b/>
+          <w:i w:val="0"/>
+          <w:color w:val="1F3A5F"/>
+          <w:sz w:val="23"/>
+        </w:rPr>
+        <w:t xml:space="preserve">8.1 Two levels of exam security</w:t>
+      </w:r>
+    </w:p>
+    <w:p>
+      <w:pPr>
+        <w:spacing w:before="0" w:after="160"/>
+      </w:pPr>
+      <w:r>
+        <w:rPr>
+          <w:rFonts w:ascii="Carlito" w:hAnsi="Carlito"/>
+          <w:b w:val="0"/>
+          <w:i w:val="0"/>
+          <w:color w:val="000000"/>
+          <w:sz w:val="22"/>
+        </w:rPr>
+        <w:t xml:space="preserve">Examination security in a laboratory setting operates at two levels, and the difference between them determines what any platform can honestly claim.</w:t>
+      </w:r>
+    </w:p>
+    <w:p>
+      <w:pPr>
+        <w:pStyle w:val="ListBullet"/>
+        <w:spacing w:after="80"/>
+        <w:ind w:left="425"/>
+      </w:pPr>
+      <w:r>
+        <w:rPr>
+          <w:b w:val="1"/>
+          <w:rFonts w:ascii="Carlito" w:hAnsi="Carlito"/>
+          <w:sz w:val="22"/>
+        </w:rPr>
+        <w:t xml:space="preserve">Browser-Level Exam Integrity</w:t>
+      </w:r>
+      <w:r>
+        <w:rPr>
+          <w:b w:val="0"/>
+          <w:rFonts w:ascii="Carlito" w:hAnsi="Carlito"/>
+          <w:sz w:val="22"/>
+        </w:rPr>
+        <w:t xml:space="preserve"> — what LabSubmit provides today. A web application can monitor and restrict behaviour inside the browser: fullscreen state, window focus, tab visibility, clipboard operations, the context menu, drag-and-drop and developer-tool shortcuts. It can record each occurrence with a timestamp and present the record to faculty.</w:t>
+      </w:r>
+    </w:p>
+    <w:p>
+      <w:pPr>
+        <w:pStyle w:val="ListBullet"/>
+        <w:spacing w:after="80"/>
+        <w:ind w:left="425"/>
+      </w:pPr>
+      <w:r>
+        <w:rPr>
+          <w:b w:val="1"/>
+          <w:rFonts w:ascii="Carlito" w:hAnsi="Carlito"/>
+          <w:sz w:val="22"/>
+        </w:rPr>
+        <w:t xml:space="preserve">OS-Level Secure Lockdown</w:t>
+      </w:r>
+      <w:r>
+        <w:rPr>
+          <w:b w:val="0"/>
+          <w:rFonts w:ascii="Carlito" w:hAnsi="Carlito"/>
+          <w:sz w:val="22"/>
+        </w:rPr>
+        <w:t xml:space="preserve"> — what LabSubmit does not provide today. Restricting the operating system itself — preventing other applications from running, controlling network access, restricting screen capture — requires a dedicated LabSubmit Secure Exam Client or Windows kiosk environment installed on the examination machine. This is proposed as future work in Section 18.</w:t>
+      </w:r>
+    </w:p>
+    <w:p>
+      <w:pPr>
+        <w:spacing w:before="0" w:after="160"/>
+      </w:pPr>
+      <w:r>
+        <w:rPr>
+          <w:rFonts w:ascii="Carlito" w:hAnsi="Carlito"/>
+          <w:b w:val="0"/>
+          <w:i w:val="0"/>
+          <w:color w:val="000000"/>
+          <w:sz w:val="22"/>
+        </w:rPr>
+        <w:t xml:space="preserve">Every statement in this proposal about examination security should be read against that distinction. Where this document says LabSubmit monitors or restricts something, it means at the browser level.</w:t>
+      </w:r>
+    </w:p>
+    <w:p>
+      <w:pPr>
+        <w:spacing w:before="200" w:after="100"/>
+      </w:pPr>
+      <w:r>
+        <w:rPr>
+          <w:rFonts w:ascii="Carlito" w:hAnsi="Carlito"/>
+          <w:b/>
+          <w:i w:val="0"/>
+          <w:color w:val="1F3A5F"/>
+          <w:sz w:val="23"/>
+        </w:rPr>
+        <w:t xml:space="preserve">8.2 The server-authoritative exam session</w:t>
+      </w:r>
+    </w:p>
+    <w:p>
+      <w:pPr>
+        <w:spacing w:before="0" w:after="160"/>
+      </w:pPr>
+      <w:r>
+        <w:rPr>
+          <w:rFonts w:ascii="Carlito" w:hAnsi="Carlito"/>
+          <w:b w:val="0"/>
+          <w:i w:val="0"/>
+          <w:color w:val="000000"/>
+          <w:sz w:val="22"/>
+        </w:rPr>
+        <w:t xml:space="preserve">The single most important design decision in Secure Exam Mode is that nothing which decides the outcome of an examination is kept anywhere the student can reach. The browser displays the exam; the server owns it.</w:t>
+      </w:r>
+    </w:p>
+    <w:p>
+      <w:pPr>
+        <w:pStyle w:val="ListBullet"/>
+        <w:spacing w:after="80"/>
+        <w:ind w:left="425"/>
+      </w:pPr>
+      <w:r>
+        <w:rPr>
+          <w:b w:val="1"/>
+          <w:rFonts w:ascii="Carlito" w:hAnsi="Carlito"/>
+          <w:sz w:val="22"/>
+        </w:rPr>
+        <w:t xml:space="preserve">The timer</w:t>
+      </w:r>
+      <w:r>
+        <w:rPr>
+          <w:b w:val="0"/>
+          <w:rFonts w:ascii="Carlito" w:hAnsi="Carlito"/>
+          <w:sz w:val="22"/>
+        </w:rPr>
+        <w:t xml:space="preserve"> — the effective deadline is the earlier of the exam's scheduled end time and the student's own start time plus the permitted duration. It is computed by the server, re-derived on every protected request, and sent to the browser only for display.</w:t>
+      </w:r>
+    </w:p>
+    <w:p>
+      <w:pPr>
+        <w:pStyle w:val="ListBullet"/>
+        <w:spacing w:after="80"/>
+        <w:ind w:left="425"/>
+      </w:pPr>
+      <w:r>
+        <w:rPr>
+          <w:b w:val="1"/>
+          <w:rFonts w:ascii="Carlito" w:hAnsi="Carlito"/>
+          <w:sz w:val="22"/>
+        </w:rPr>
+        <w:t xml:space="preserve">The attempt</w:t>
+      </w:r>
+      <w:r>
+        <w:rPr>
+          <w:b w:val="0"/>
+          <w:rFonts w:ascii="Carlito" w:hAnsi="Carlito"/>
+          <w:sz w:val="22"/>
+        </w:rPr>
+        <w:t xml:space="preserve"> — an attempt is created server-side when the student explicitly starts the exam, and one attempt exists per student per exam.</w:t>
+      </w:r>
+    </w:p>
+    <w:p>
+      <w:pPr>
+        <w:pStyle w:val="ListBullet"/>
+        <w:spacing w:after="80"/>
+        <w:ind w:left="425"/>
+      </w:pPr>
+      <w:r>
+        <w:rPr>
+          <w:b w:val="1"/>
+          <w:rFonts w:ascii="Carlito" w:hAnsi="Carlito"/>
+          <w:sz w:val="22"/>
+        </w:rPr>
+        <w:t xml:space="preserve">Authorisation</w:t>
+      </w:r>
+      <w:r>
+        <w:rPr>
+          <w:b w:val="0"/>
+          <w:rFonts w:ascii="Carlito" w:hAnsi="Carlito"/>
+          <w:sz w:val="22"/>
+        </w:rPr>
+        <w:t xml:space="preserve"> — every protected endpoint independently re-verifies the caller's role, ownership of the workspace, the exam window and the deadline before acting. This includes the WebSocket channel that compiles and runs code.</w:t>
+      </w:r>
+    </w:p>
+    <w:p>
+      <w:pPr>
+        <w:pStyle w:val="ListBullet"/>
+        <w:spacing w:after="80"/>
+        <w:ind w:left="425"/>
+      </w:pPr>
+      <w:r>
+        <w:rPr>
+          <w:b w:val="1"/>
+          <w:rFonts w:ascii="Carlito" w:hAnsi="Carlito"/>
+          <w:sz w:val="22"/>
+        </w:rPr>
+        <w:t xml:space="preserve">The submission</w:t>
+      </w:r>
+      <w:r>
+        <w:rPr>
+          <w:b w:val="0"/>
+          <w:rFonts w:ascii="Carlito" w:hAnsi="Carlito"/>
+          <w:sz w:val="22"/>
+        </w:rPr>
+        <w:t xml:space="preserve"> — manual submission, expiry of the server deadline and threshold auto-submission all pass through one idempotent server-side routine, so the three paths cannot diverge or produce duplicate records.</w:t>
+      </w:r>
+    </w:p>
+    <w:p>
+      <w:pPr>
+        <w:spacing w:before="0" w:after="160"/>
+      </w:pPr>
+      <w:r>
+        <w:rPr>
+          <w:rFonts w:ascii="Carlito" w:hAnsi="Carlito"/>
+          <w:b w:val="0"/>
+          <w:i w:val="0"/>
+          <w:color w:val="000000"/>
+          <w:sz w:val="22"/>
+        </w:rPr>
+        <w:t xml:space="preserve">The practical consequence is that a student cannot legitimately extend an examination by altering the countdown displayed in the browser, editing JavaScript state, clearing local storage, changing the computer's system clock, or replaying a network request. An attempt that is past its deadline is finalised by the server on the next request that touches it, whether or not the browser ever reports back.</w:t>
+      </w:r>
+    </w:p>
+    <w:p>
+      <w:pPr>
+        <w:spacing w:before="200" w:after="100"/>
+      </w:pPr>
+      <w:r>
+        <w:rPr>
+          <w:rFonts w:ascii="Carlito" w:hAnsi="Carlito"/>
+          <w:b/>
+          <w:i w:val="0"/>
+          <w:color w:val="1F3A5F"/>
+          <w:sz w:val="23"/>
+        </w:rPr>
+        <w:t xml:space="preserve">8.3 Integrity events and severity</w:t>
+      </w:r>
+    </w:p>
+    <w:p>
+      <w:pPr>
+        <w:spacing w:before="0" w:after="160"/>
+      </w:pPr>
+      <w:r>
+        <w:rPr>
+          <w:rFonts w:ascii="Carlito" w:hAnsi="Carlito"/>
+          <w:b w:val="0"/>
+          <w:i w:val="0"/>
+          <w:color w:val="000000"/>
+          <w:sz w:val="22"/>
+        </w:rPr>
+        <w:t xml:space="preserve">Each detected event is debounced in the browser, deduplicated on the server, and stored with its type, its context and a server-side timestamp against the student's attempt. The table below sets out the event taxonomy and the severity classification, and states plainly which events the platform records today and which are proposed as part of the next phase of work.</w:t>
+      </w:r>
+    </w:p>
+    <w:tbl>
+      <w:tblPr>
+        <w:tblStyle w:val="TableGrid"/>
+        <w:tblW w:type="auto" w:w="0"/>
+        <w:jc w:val="center"/>
+        <w:tblLook w:firstColumn="1" w:firstRow="1" w:lastColumn="0" w:lastRow="0" w:noHBand="0" w:noVBand="1" w:val="04A0"/>
+      </w:tblPr>
+      <w:tblGrid>
+        <w:gridCol w:w="1368"/>
+        <w:gridCol w:w="4392"/>
+        <w:gridCol w:w="3268"/>
+      </w:tblGrid>
+      <w:tr>
+        <w:trPr>
+          <w:cantSplit/>
+        </w:trPr>
+        <w:tc>
+          <w:tcPr>
+            <w:tcW w:w="1368" w:type="dxa"/>
+            <w:shd w:val="clear" w:color="auto" w:fill="1F3A5F"/>
+          </w:tcPr>
+          <w:p>
+            <w:pPr>
+              <w:spacing w:after="40" w:before="40"/>
+            </w:pPr>
+            <w:r>
+              <w:rPr>
+                <w:rFonts w:ascii="Carlito" w:hAnsi="Carlito"/>
+                <w:b/>
+                <w:color w:val="FFFFFF"/>
+                <w:sz w:val="20"/>
+              </w:rPr>
+              <w:t xml:space="preserve">Severity</w:t>
+            </w:r>
+          </w:p>
+        </w:tc>
+        <w:tc>
+          <w:tcPr>
+            <w:tcW w:w="4392" w:type="dxa"/>
+            <w:shd w:val="clear" w:color="auto" w:fill="1F3A5F"/>
+          </w:tcPr>
+          <w:p>
+            <w:pPr>
+              <w:spacing w:after="40" w:before="40"/>
+            </w:pPr>
+            <w:r>
+              <w:rPr>
+                <w:rFonts w:ascii="Carlito" w:hAnsi="Carlito"/>
+                <w:b/>
+                <w:color w:val="FFFFFF"/>
+                <w:sz w:val="20"/>
+              </w:rPr>
+              <w:t xml:space="preserve">Integrity event</w:t>
+            </w:r>
+          </w:p>
+        </w:tc>
+        <w:tc>
+          <w:tcPr>
+            <w:tcW w:w="3268" w:type="dxa"/>
+            <w:shd w:val="clear" w:color="auto" w:fill="1F3A5F"/>
+          </w:tcPr>
+          <w:p>
+            <w:pPr>
+              <w:spacing w:after="40" w:before="40"/>
+            </w:pPr>
+            <w:r>
+              <w:rPr>
+                <w:rFonts w:ascii="Carlito" w:hAnsi="Carlito"/>
+                <w:b/>
+                <w:color w:val="FFFFFF"/>
+                <w:sz w:val="20"/>
+              </w:rPr>
+              <w:t xml:space="preserve">Status in the platform today</w:t>
+            </w:r>
+          </w:p>
+        </w:tc>
+      </w:tr>
+      <w:tr>
+        <w:trPr>
+          <w:cantSplit/>
+        </w:trPr>
+        <w:tc>
+          <w:tcPr>
+            <w:tcW w:w="1368" w:type="dxa"/>
+          </w:tcPr>
+          <w:p>
+            <w:pPr>
+              <w:spacing w:after="40" w:before="40"/>
+            </w:pPr>
+            <w:r>
+              <w:rPr>
+                <w:rFonts w:ascii="Carlito" w:hAnsi="Carlito"/>
+                <w:sz w:val="20"/>
+              </w:rPr>
+              <w:t xml:space="preserve">LOW</w:t>
+            </w:r>
+          </w:p>
+        </w:tc>
+        <w:tc>
+          <w:tcPr>
+            <w:tcW w:w="4392" w:type="dxa"/>
+          </w:tcPr>
+          <w:p>
+            <w:pPr>
+              <w:spacing w:after="40" w:before="40"/>
+            </w:pPr>
+            <w:r>
+              <w:rPr>
+                <w:rFonts w:ascii="Carlito" w:hAnsi="Carlito"/>
+                <w:sz w:val="20"/>
+              </w:rPr>
+              <w:t xml:space="preserve">Copy attempt</w:t>
+            </w:r>
+          </w:p>
+        </w:tc>
+        <w:tc>
+          <w:tcPr>
+            <w:tcW w:w="3268" w:type="dxa"/>
+          </w:tcPr>
+          <w:p>
+            <w:pPr>
+              <w:spacing w:after="40" w:before="40"/>
+            </w:pPr>
+            <w:r>
+              <w:rPr>
+                <w:rFonts w:ascii="Carlito" w:hAnsi="Carlito"/>
+                <w:sz w:val="20"/>
+              </w:rPr>
+              <w:t xml:space="preserve">Blocked in the browser; event logging proposed</w:t>
+            </w:r>
+          </w:p>
+        </w:tc>
+      </w:tr>
+      <w:tr>
+        <w:trPr>
+          <w:cantSplit/>
+        </w:trPr>
+        <w:tc>
+          <w:tcPr>
+            <w:tcW w:w="1368" w:type="dxa"/>
+          </w:tcPr>
+          <w:p>
+            <w:pPr>
+              <w:spacing w:after="40" w:before="40"/>
+            </w:pPr>
+            <w:r>
+              <w:rPr>
+                <w:rFonts w:ascii="Carlito" w:hAnsi="Carlito"/>
+                <w:sz w:val="20"/>
+              </w:rPr>
+              <w:t xml:space="preserve">LOW</w:t>
+            </w:r>
+          </w:p>
+        </w:tc>
+        <w:tc>
+          <w:tcPr>
+            <w:tcW w:w="4392" w:type="dxa"/>
+          </w:tcPr>
+          <w:p>
+            <w:pPr>
+              <w:spacing w:after="40" w:before="40"/>
+            </w:pPr>
+            <w:r>
+              <w:rPr>
+                <w:rFonts w:ascii="Carlito" w:hAnsi="Carlito"/>
+                <w:sz w:val="20"/>
+              </w:rPr>
+              <w:t xml:space="preserve">Cut attempt</w:t>
+            </w:r>
+          </w:p>
+        </w:tc>
+        <w:tc>
+          <w:tcPr>
+            <w:tcW w:w="3268" w:type="dxa"/>
+          </w:tcPr>
+          <w:p>
+            <w:pPr>
+              <w:spacing w:after="40" w:before="40"/>
+            </w:pPr>
+            <w:r>
+              <w:rPr>
+                <w:rFonts w:ascii="Carlito" w:hAnsi="Carlito"/>
+                <w:sz w:val="20"/>
+              </w:rPr>
+              <w:t xml:space="preserve">Blocked in the browser; event logging proposed</w:t>
+            </w:r>
+          </w:p>
+        </w:tc>
+      </w:tr>
+      <w:tr>
+        <w:trPr>
+          <w:cantSplit/>
+        </w:trPr>
+        <w:tc>
+          <w:tcPr>
+            <w:tcW w:w="1368" w:type="dxa"/>
+          </w:tcPr>
+          <w:p>
+            <w:pPr>
+              <w:spacing w:after="40" w:before="40"/>
+            </w:pPr>
+            <w:r>
+              <w:rPr>
+                <w:rFonts w:ascii="Carlito" w:hAnsi="Carlito"/>
+                <w:sz w:val="20"/>
+              </w:rPr>
+              <w:t xml:space="preserve">LOW</w:t>
+            </w:r>
+          </w:p>
+        </w:tc>
+        <w:tc>
+          <w:tcPr>
+            <w:tcW w:w="4392" w:type="dxa"/>
+          </w:tcPr>
+          <w:p>
+            <w:pPr>
+              <w:spacing w:after="40" w:before="40"/>
+            </w:pPr>
+            <w:r>
+              <w:rPr>
+                <w:rFonts w:ascii="Carlito" w:hAnsi="Carlito"/>
+                <w:sz w:val="20"/>
+              </w:rPr>
+              <w:t xml:space="preserve">Context-menu attempt</w:t>
+            </w:r>
+          </w:p>
+        </w:tc>
+        <w:tc>
+          <w:tcPr>
+            <w:tcW w:w="3268" w:type="dxa"/>
+          </w:tcPr>
+          <w:p>
+            <w:pPr>
+              <w:spacing w:after="40" w:before="40"/>
+            </w:pPr>
+            <w:r>
+              <w:rPr>
+                <w:rFonts w:ascii="Carlito" w:hAnsi="Carlito"/>
+                <w:sz w:val="20"/>
+              </w:rPr>
+              <w:t xml:space="preserve">Blocked in the browser; event logging proposed</w:t>
+            </w:r>
+          </w:p>
+        </w:tc>
+      </w:tr>
+      <w:tr>
+        <w:trPr>
+          <w:cantSplit/>
+        </w:trPr>
+        <w:tc>
+          <w:tcPr>
+            <w:tcW w:w="1368" w:type="dxa"/>
+          </w:tcPr>
+          <w:p>
+            <w:pPr>
+              <w:spacing w:after="40" w:before="40"/>
+            </w:pPr>
+            <w:r>
+              <w:rPr>
+                <w:rFonts w:ascii="Carlito" w:hAnsi="Carlito"/>
+                <w:sz w:val="20"/>
+              </w:rPr>
+              <w:t xml:space="preserve">LOW</w:t>
+            </w:r>
+          </w:p>
+        </w:tc>
+        <w:tc>
+          <w:tcPr>
+            <w:tcW w:w="4392" w:type="dxa"/>
+          </w:tcPr>
+          <w:p>
+            <w:pPr>
+              <w:spacing w:after="40" w:before="40"/>
+            </w:pPr>
+            <w:r>
+              <w:rPr>
+                <w:rFonts w:ascii="Carlito" w:hAnsi="Carlito"/>
+                <w:sz w:val="20"/>
+              </w:rPr>
+              <w:t xml:space="preserve">Drag-and-drop attempt</w:t>
+            </w:r>
+          </w:p>
+        </w:tc>
+        <w:tc>
+          <w:tcPr>
+            <w:tcW w:w="3268" w:type="dxa"/>
+          </w:tcPr>
+          <w:p>
+            <w:pPr>
+              <w:spacing w:after="40" w:before="40"/>
+            </w:pPr>
+            <w:r>
+              <w:rPr>
+                <w:rFonts w:ascii="Carlito" w:hAnsi="Carlito"/>
+                <w:sz w:val="20"/>
+              </w:rPr>
+              <w:t xml:space="preserve">Blocked in the browser; event logging proposed</w:t>
+            </w:r>
+          </w:p>
+        </w:tc>
+      </w:tr>
+      <w:tr>
+        <w:trPr>
+          <w:cantSplit/>
+        </w:trPr>
+        <w:tc>
+          <w:tcPr>
+            <w:tcW w:w="1368" w:type="dxa"/>
+          </w:tcPr>
+          <w:p>
+            <w:pPr>
+              <w:spacing w:after="40" w:before="40"/>
+            </w:pPr>
+            <w:r>
+              <w:rPr>
+                <w:rFonts w:ascii="Carlito" w:hAnsi="Carlito"/>
+                <w:sz w:val="20"/>
+              </w:rPr>
+              <w:t xml:space="preserve">MEDIUM</w:t>
+            </w:r>
+          </w:p>
+        </w:tc>
+        <w:tc>
+          <w:tcPr>
+            <w:tcW w:w="4392" w:type="dxa"/>
+          </w:tcPr>
+          <w:p>
+            <w:pPr>
+              <w:spacing w:after="40" w:before="40"/>
+            </w:pPr>
+            <w:r>
+              <w:rPr>
+                <w:rFonts w:ascii="Carlito" w:hAnsi="Carlito"/>
+                <w:sz w:val="20"/>
+              </w:rPr>
+              <w:t xml:space="preserve">Fullscreen exit</w:t>
+            </w:r>
+          </w:p>
+        </w:tc>
+        <w:tc>
+          <w:tcPr>
+            <w:tcW w:w="3268" w:type="dxa"/>
+          </w:tcPr>
+          <w:p>
+            <w:pPr>
+              <w:spacing w:after="40" w:before="40"/>
+            </w:pPr>
+            <w:r>
+              <w:rPr>
+                <w:rFonts w:ascii="Carlito" w:hAnsi="Carlito"/>
+                <w:sz w:val="20"/>
+              </w:rPr>
+              <w:t xml:space="preserve">Recorded</w:t>
+            </w:r>
+          </w:p>
+        </w:tc>
+      </w:tr>
+      <w:tr>
+        <w:trPr>
+          <w:cantSplit/>
+        </w:trPr>
+        <w:tc>
+          <w:tcPr>
+            <w:tcW w:w="1368" w:type="dxa"/>
+          </w:tcPr>
+          <w:p>
+            <w:pPr>
+              <w:spacing w:after="40" w:before="40"/>
+            </w:pPr>
+            <w:r>
+              <w:rPr>
+                <w:rFonts w:ascii="Carlito" w:hAnsi="Carlito"/>
+                <w:sz w:val="20"/>
+              </w:rPr>
+              <w:t xml:space="preserve">MEDIUM</w:t>
+            </w:r>
+          </w:p>
+        </w:tc>
+        <w:tc>
+          <w:tcPr>
+            <w:tcW w:w="4392" w:type="dxa"/>
+          </w:tcPr>
+          <w:p>
+            <w:pPr>
+              <w:spacing w:after="40" w:before="40"/>
+            </w:pPr>
+            <w:r>
+              <w:rPr>
+                <w:rFonts w:ascii="Carlito" w:hAnsi="Carlito"/>
+                <w:sz w:val="20"/>
+              </w:rPr>
+              <w:t xml:space="preserve">Tab hidden or window minimised</w:t>
+            </w:r>
+          </w:p>
+        </w:tc>
+        <w:tc>
+          <w:tcPr>
+            <w:tcW w:w="3268" w:type="dxa"/>
+          </w:tcPr>
+          <w:p>
+            <w:pPr>
+              <w:spacing w:after="40" w:before="40"/>
+            </w:pPr>
+            <w:r>
+              <w:rPr>
+                <w:rFonts w:ascii="Carlito" w:hAnsi="Carlito"/>
+                <w:sz w:val="20"/>
+              </w:rPr>
+              <w:t xml:space="preserve">Recorded</w:t>
+            </w:r>
+          </w:p>
+        </w:tc>
+      </w:tr>
+      <w:tr>
+        <w:trPr>
+          <w:cantSplit/>
+        </w:trPr>
+        <w:tc>
+          <w:tcPr>
+            <w:tcW w:w="1368" w:type="dxa"/>
+          </w:tcPr>
+          <w:p>
+            <w:pPr>
+              <w:spacing w:after="40" w:before="40"/>
+            </w:pPr>
+            <w:r>
+              <w:rPr>
+                <w:rFonts w:ascii="Carlito" w:hAnsi="Carlito"/>
+                <w:sz w:val="20"/>
+              </w:rPr>
+              <w:t xml:space="preserve">MEDIUM</w:t>
+            </w:r>
+          </w:p>
+        </w:tc>
+        <w:tc>
+          <w:tcPr>
+            <w:tcW w:w="4392" w:type="dxa"/>
+          </w:tcPr>
+          <w:p>
+            <w:pPr>
+              <w:spacing w:after="40" w:before="40"/>
+            </w:pPr>
+            <w:r>
+              <w:rPr>
+                <w:rFonts w:ascii="Carlito" w:hAnsi="Carlito"/>
+                <w:sz w:val="20"/>
+              </w:rPr>
+              <w:t xml:space="preserve">Window blur (focus lost)</w:t>
+            </w:r>
+          </w:p>
+        </w:tc>
+        <w:tc>
+          <w:tcPr>
+            <w:tcW w:w="3268" w:type="dxa"/>
+          </w:tcPr>
+          <w:p>
+            <w:pPr>
+              <w:spacing w:after="40" w:before="40"/>
+            </w:pPr>
+            <w:r>
+              <w:rPr>
+                <w:rFonts w:ascii="Carlito" w:hAnsi="Carlito"/>
+                <w:sz w:val="20"/>
+              </w:rPr>
+              <w:t xml:space="preserve">Recorded</w:t>
+            </w:r>
+          </w:p>
+        </w:tc>
+      </w:tr>
+      <w:tr>
+        <w:trPr>
+          <w:cantSplit/>
+        </w:trPr>
+        <w:tc>
+          <w:tcPr>
+            <w:tcW w:w="1368" w:type="dxa"/>
+          </w:tcPr>
+          <w:p>
+            <w:pPr>
+              <w:spacing w:after="40" w:before="40"/>
+            </w:pPr>
+            <w:r>
+              <w:rPr>
+                <w:rFonts w:ascii="Carlito" w:hAnsi="Carlito"/>
+                <w:sz w:val="20"/>
+              </w:rPr>
+              <w:t xml:space="preserve">MEDIUM</w:t>
+            </w:r>
+          </w:p>
+        </w:tc>
+        <w:tc>
+          <w:tcPr>
+            <w:tcW w:w="4392" w:type="dxa"/>
+          </w:tcPr>
+          <w:p>
+            <w:pPr>
+              <w:spacing w:after="40" w:before="40"/>
+            </w:pPr>
+            <w:r>
+              <w:rPr>
+                <w:rFonts w:ascii="Carlito" w:hAnsi="Carlito"/>
+                <w:sz w:val="20"/>
+              </w:rPr>
+              <w:t xml:space="preserve">Developer-tools shortcut</w:t>
+            </w:r>
+          </w:p>
+        </w:tc>
+        <w:tc>
+          <w:tcPr>
+            <w:tcW w:w="3268" w:type="dxa"/>
+          </w:tcPr>
+          <w:p>
+            <w:pPr>
+              <w:spacing w:after="40" w:before="40"/>
+            </w:pPr>
+            <w:r>
+              <w:rPr>
+                <w:rFonts w:ascii="Carlito" w:hAnsi="Carlito"/>
+                <w:sz w:val="20"/>
+              </w:rPr>
+              <w:t xml:space="preserve">Recorded</w:t>
+            </w:r>
+          </w:p>
+        </w:tc>
+      </w:tr>
+      <w:tr>
+        <w:trPr>
+          <w:cantSplit/>
+        </w:trPr>
+        <w:tc>
+          <w:tcPr>
+            <w:tcW w:w="1368" w:type="dxa"/>
+          </w:tcPr>
+          <w:p>
+            <w:pPr>
+              <w:spacing w:after="40" w:before="40"/>
+            </w:pPr>
+            <w:r>
+              <w:rPr>
+                <w:rFonts w:ascii="Carlito" w:hAnsi="Carlito"/>
+                <w:sz w:val="20"/>
+              </w:rPr>
+              <w:t xml:space="preserve">MEDIUM</w:t>
+            </w:r>
+          </w:p>
+        </w:tc>
+        <w:tc>
+          <w:tcPr>
+            <w:tcW w:w="4392" w:type="dxa"/>
+          </w:tcPr>
+          <w:p>
+            <w:pPr>
+              <w:spacing w:after="40" w:before="40"/>
+            </w:pPr>
+            <w:r>
+              <w:rPr>
+                <w:rFonts w:ascii="Carlito" w:hAnsi="Carlito"/>
+                <w:sz w:val="20"/>
+              </w:rPr>
+              <w:t xml:space="preserve">Paste attempt</w:t>
+            </w:r>
+          </w:p>
+        </w:tc>
+        <w:tc>
+          <w:tcPr>
+            <w:tcW w:w="3268" w:type="dxa"/>
+          </w:tcPr>
+          <w:p>
+            <w:pPr>
+              <w:spacing w:after="40" w:before="40"/>
+            </w:pPr>
+            <w:r>
+              <w:rPr>
+                <w:rFonts w:ascii="Carlito" w:hAnsi="Carlito"/>
+                <w:sz w:val="20"/>
+              </w:rPr>
+              <w:t xml:space="preserve">Blocked in the browser; event logging proposed</w:t>
+            </w:r>
+          </w:p>
+        </w:tc>
+      </w:tr>
+      <w:tr>
+        <w:trPr>
+          <w:cantSplit/>
+        </w:trPr>
+        <w:tc>
+          <w:tcPr>
+            <w:tcW w:w="1368" w:type="dxa"/>
+          </w:tcPr>
+          <w:p>
+            <w:pPr>
+              <w:spacing w:after="40" w:before="40"/>
+            </w:pPr>
+            <w:r>
+              <w:rPr>
+                <w:rFonts w:ascii="Carlito" w:hAnsi="Carlito"/>
+                <w:sz w:val="20"/>
+              </w:rPr>
+              <w:t xml:space="preserve">HIGH</w:t>
+            </w:r>
+          </w:p>
+        </w:tc>
+        <w:tc>
+          <w:tcPr>
+            <w:tcW w:w="4392" w:type="dxa"/>
+          </w:tcPr>
+          <w:p>
+            <w:pPr>
+              <w:spacing w:after="40" w:before="40"/>
+            </w:pPr>
+            <w:r>
+              <w:rPr>
+                <w:rFonts w:ascii="Carlito" w:hAnsi="Carlito"/>
+                <w:sz w:val="20"/>
+              </w:rPr>
+              <w:t xml:space="preserve">Repeated fullscreen exit reaching the auto-submit threshold</w:t>
+            </w:r>
+          </w:p>
+        </w:tc>
+        <w:tc>
+          <w:tcPr>
+            <w:tcW w:w="3268" w:type="dxa"/>
+          </w:tcPr>
+          <w:p>
+            <w:pPr>
+              <w:spacing w:after="40" w:before="40"/>
+            </w:pPr>
+            <w:r>
+              <w:rPr>
+                <w:rFonts w:ascii="Carlito" w:hAnsi="Carlito"/>
+                <w:sz w:val="20"/>
+              </w:rPr>
+              <w:t xml:space="preserve">Recorded</w:t>
+            </w:r>
+          </w:p>
+        </w:tc>
+      </w:tr>
+      <w:tr>
+        <w:trPr>
+          <w:cantSplit/>
+        </w:trPr>
+        <w:tc>
+          <w:tcPr>
+            <w:tcW w:w="1368" w:type="dxa"/>
+          </w:tcPr>
+          <w:p>
+            <w:pPr>
+              <w:spacing w:after="40" w:before="40"/>
+            </w:pPr>
+            <w:r>
+              <w:rPr>
+                <w:rFonts w:ascii="Carlito" w:hAnsi="Carlito"/>
+                <w:sz w:val="20"/>
+              </w:rPr>
+              <w:t xml:space="preserve">HIGH</w:t>
+            </w:r>
+          </w:p>
+        </w:tc>
+        <w:tc>
+          <w:tcPr>
+            <w:tcW w:w="4392" w:type="dxa"/>
+          </w:tcPr>
+          <w:p>
+            <w:pPr>
+              <w:spacing w:after="40" w:before="40"/>
+            </w:pPr>
+            <w:r>
+              <w:rPr>
+                <w:rFonts w:ascii="Carlito" w:hAnsi="Carlito"/>
+                <w:sz w:val="20"/>
+              </w:rPr>
+              <w:t xml:space="preserve">Repeated focus loss within a short window</w:t>
+            </w:r>
+          </w:p>
+        </w:tc>
+        <w:tc>
+          <w:tcPr>
+            <w:tcW w:w="3268" w:type="dxa"/>
+          </w:tcPr>
+          <w:p>
+            <w:pPr>
+              <w:spacing w:after="40" w:before="40"/>
+            </w:pPr>
+            <w:r>
+              <w:rPr>
+                <w:rFonts w:ascii="Carlito" w:hAnsi="Carlito"/>
+                <w:sz w:val="20"/>
+              </w:rPr>
+              <w:t xml:space="preserve">Proposed</w:t>
+            </w:r>
+          </w:p>
+        </w:tc>
+      </w:tr>
+      <w:tr>
+        <w:trPr>
+          <w:cantSplit/>
+        </w:trPr>
+        <w:tc>
+          <w:tcPr>
+            <w:tcW w:w="1368" w:type="dxa"/>
+          </w:tcPr>
+          <w:p>
+            <w:pPr>
+              <w:spacing w:after="40" w:before="40"/>
+            </w:pPr>
+            <w:r>
+              <w:rPr>
+                <w:rFonts w:ascii="Carlito" w:hAnsi="Carlito"/>
+                <w:sz w:val="20"/>
+              </w:rPr>
+              <w:t xml:space="preserve">HIGH</w:t>
+            </w:r>
+          </w:p>
+        </w:tc>
+        <w:tc>
+          <w:tcPr>
+            <w:tcW w:w="4392" w:type="dxa"/>
+          </w:tcPr>
+          <w:p>
+            <w:pPr>
+              <w:spacing w:after="40" w:before="40"/>
+            </w:pPr>
+            <w:r>
+              <w:rPr>
+                <w:rFonts w:ascii="Carlito" w:hAnsi="Carlito"/>
+                <w:sz w:val="20"/>
+              </w:rPr>
+              <w:t xml:space="preserve">Duplicate exam session</w:t>
+            </w:r>
+          </w:p>
+        </w:tc>
+        <w:tc>
+          <w:tcPr>
+            <w:tcW w:w="3268" w:type="dxa"/>
+          </w:tcPr>
+          <w:p>
+            <w:pPr>
+              <w:spacing w:after="40" w:before="40"/>
+            </w:pPr>
+            <w:r>
+              <w:rPr>
+                <w:rFonts w:ascii="Carlito" w:hAnsi="Carlito"/>
+                <w:sz w:val="20"/>
+              </w:rPr>
+              <w:t xml:space="preserve">Proposed</w:t>
+            </w:r>
+          </w:p>
+        </w:tc>
+      </w:tr>
+      <w:tr>
+        <w:trPr>
+          <w:cantSplit/>
+        </w:trPr>
+        <w:tc>
+          <w:tcPr>
+            <w:tcW w:w="1368" w:type="dxa"/>
+          </w:tcPr>
+          <w:p>
+            <w:pPr>
+              <w:spacing w:after="40" w:before="40"/>
+            </w:pPr>
+            <w:r>
+              <w:rPr>
+                <w:rFonts w:ascii="Carlito" w:hAnsi="Carlito"/>
+                <w:sz w:val="20"/>
+              </w:rPr>
+              <w:t xml:space="preserve">CRITICAL</w:t>
+            </w:r>
+          </w:p>
+        </w:tc>
+        <w:tc>
+          <w:tcPr>
+            <w:tcW w:w="4392" w:type="dxa"/>
+          </w:tcPr>
+          <w:p>
+            <w:pPr>
+              <w:spacing w:after="40" w:before="40"/>
+            </w:pPr>
+            <w:r>
+              <w:rPr>
+                <w:rFonts w:ascii="Carlito" w:hAnsi="Carlito"/>
+                <w:sz w:val="20"/>
+              </w:rPr>
+              <w:t xml:space="preserve">Unauthorised exam access</w:t>
+            </w:r>
+          </w:p>
+        </w:tc>
+        <w:tc>
+          <w:tcPr>
+            <w:tcW w:w="3268" w:type="dxa"/>
+          </w:tcPr>
+          <w:p>
+            <w:pPr>
+              <w:spacing w:after="40" w:before="40"/>
+            </w:pPr>
+            <w:r>
+              <w:rPr>
+                <w:rFonts w:ascii="Carlito" w:hAnsi="Carlito"/>
+                <w:sz w:val="20"/>
+              </w:rPr>
+              <w:t xml:space="preserve">Refused by the backend; event logging proposed</w:t>
+            </w:r>
+          </w:p>
+        </w:tc>
+      </w:tr>
+      <w:tr>
+        <w:trPr>
+          <w:cantSplit/>
+        </w:trPr>
+        <w:tc>
+          <w:tcPr>
+            <w:tcW w:w="1368" w:type="dxa"/>
+          </w:tcPr>
+          <w:p>
+            <w:pPr>
+              <w:spacing w:after="40" w:before="40"/>
+            </w:pPr>
+            <w:r>
+              <w:rPr>
+                <w:rFonts w:ascii="Carlito" w:hAnsi="Carlito"/>
+                <w:sz w:val="20"/>
+              </w:rPr>
+              <w:t xml:space="preserve">CRITICAL</w:t>
+            </w:r>
+          </w:p>
+        </w:tc>
+        <w:tc>
+          <w:tcPr>
+            <w:tcW w:w="4392" w:type="dxa"/>
+          </w:tcPr>
+          <w:p>
+            <w:pPr>
+              <w:spacing w:after="40" w:before="40"/>
+            </w:pPr>
+            <w:r>
+              <w:rPr>
+                <w:rFonts w:ascii="Carlito" w:hAnsi="Carlito"/>
+                <w:sz w:val="20"/>
+              </w:rPr>
+              <w:t xml:space="preserve">Unauthorised submission</w:t>
+            </w:r>
+          </w:p>
+        </w:tc>
+        <w:tc>
+          <w:tcPr>
+            <w:tcW w:w="3268" w:type="dxa"/>
+          </w:tcPr>
+          <w:p>
+            <w:pPr>
+              <w:spacing w:after="40" w:before="40"/>
+            </w:pPr>
+            <w:r>
+              <w:rPr>
+                <w:rFonts w:ascii="Carlito" w:hAnsi="Carlito"/>
+                <w:sz w:val="20"/>
+              </w:rPr>
+              <w:t xml:space="preserve">Refused by the backend; event logging proposed</w:t>
+            </w:r>
+          </w:p>
+        </w:tc>
+      </w:tr>
+      <w:tr>
+        <w:trPr>
+          <w:cantSplit/>
+        </w:trPr>
+        <w:tc>
+          <w:tcPr>
+            <w:tcW w:w="1368" w:type="dxa"/>
+          </w:tcPr>
+          <w:p>
+            <w:pPr>
+              <w:spacing w:after="40" w:before="40"/>
+            </w:pPr>
+            <w:r>
+              <w:rPr>
+                <w:rFonts w:ascii="Carlito" w:hAnsi="Carlito"/>
+                <w:sz w:val="20"/>
+              </w:rPr>
+              <w:t xml:space="preserve">CRITICAL</w:t>
+            </w:r>
+          </w:p>
+        </w:tc>
+        <w:tc>
+          <w:tcPr>
+            <w:tcW w:w="4392" w:type="dxa"/>
+          </w:tcPr>
+          <w:p>
+            <w:pPr>
+              <w:spacing w:after="40" w:before="40"/>
+            </w:pPr>
+            <w:r>
+              <w:rPr>
+                <w:rFonts w:ascii="Carlito" w:hAnsi="Carlito"/>
+                <w:sz w:val="20"/>
+              </w:rPr>
+              <w:t xml:space="preserve">Backend authorisation violation</w:t>
+            </w:r>
+          </w:p>
+        </w:tc>
+        <w:tc>
+          <w:tcPr>
+            <w:tcW w:w="3268" w:type="dxa"/>
+          </w:tcPr>
+          <w:p>
+            <w:pPr>
+              <w:spacing w:after="40" w:before="40"/>
+            </w:pPr>
+            <w:r>
+              <w:rPr>
+                <w:rFonts w:ascii="Carlito" w:hAnsi="Carlito"/>
+                <w:sz w:val="20"/>
+              </w:rPr>
+              <w:t xml:space="preserve">Refused by the backend; event logging proposed</w:t>
+            </w:r>
+          </w:p>
+        </w:tc>
+      </w:tr>
+    </w:tbl>
+    <w:p/>
+    <w:p>
+      <w:pPr>
+        <w:spacing w:before="0" w:after="200"/>
+      </w:pPr>
+      <w:r>
+        <w:rPr>
+          <w:rFonts w:ascii="Carlito" w:hAnsi="Carlito"/>
+          <w:b w:val="0"/>
+          <w:i/>
+          <w:color w:val="595959"/>
+          <w:sz w:val="17"/>
+        </w:rPr>
+        <w:t xml:space="preserve">Integrity events are signals for review, not automatic proof of academic misconduct. The platform never alters a mark on the strength of an event. The only automatic consequence anywhere in the system is submission of the attempt when a faculty-set fullscreen-exit threshold is crossed, and that threshold is set by the lecturer who authored the exam.</w:t>
+      </w:r>
+    </w:p>
+    <w:p>
+      <w:pPr>
+        <w:spacing w:before="200" w:after="100"/>
+      </w:pPr>
+      <w:r>
+        <w:rPr>
+          <w:rFonts w:ascii="Carlito" w:hAnsi="Carlito"/>
+          <w:b/>
+          <w:i w:val="0"/>
+          <w:color w:val="1F3A5F"/>
+          <w:sz w:val="23"/>
+        </w:rPr>
+        <w:t xml:space="preserve">8.4 Faculty integrity review</w:t>
+      </w:r>
+    </w:p>
+    <w:p>
+      <w:pPr>
+        <w:spacing w:before="0" w:after="160"/>
+      </w:pPr>
+      <w:r>
+        <w:rPr>
+          <w:rFonts w:ascii="Carlito" w:hAnsi="Carlito"/>
+          <w:b w:val="0"/>
+          <w:i w:val="0"/>
+          <w:color w:val="000000"/>
+          <w:sz w:val="22"/>
+        </w:rPr>
+        <w:t xml:space="preserve">Detection is only useful if the person deciding the mark can see what was detected. Faculty review integrity events in three places:</w:t>
+      </w:r>
+    </w:p>
+    <w:p>
+      <w:pPr>
+        <w:pStyle w:val="ListBullet"/>
+        <w:spacing w:after="80"/>
+        <w:ind w:left="425"/>
+      </w:pPr>
+      <w:r>
+        <w:rPr>
+          <w:b w:val="1"/>
+          <w:rFonts w:ascii="Carlito" w:hAnsi="Carlito"/>
+          <w:sz w:val="22"/>
+        </w:rPr>
+        <w:t xml:space="preserve">The violation log</w:t>
+      </w:r>
+      <w:r>
+        <w:rPr>
+          <w:b w:val="0"/>
+          <w:rFonts w:ascii="Carlito" w:hAnsi="Carlito"/>
+          <w:sz w:val="22"/>
+        </w:rPr>
+        <w:t xml:space="preserve"> — every event for the exams a lecturer owns, filterable by year and section, showing the student, roll number, exam, event type, detail and timestamp.</w:t>
+      </w:r>
+    </w:p>
+    <w:p>
+      <w:pPr>
+        <w:pStyle w:val="ListBullet"/>
+        <w:spacing w:after="80"/>
+        <w:ind w:left="425"/>
+      </w:pPr>
+      <w:r>
+        <w:rPr>
+          <w:b w:val="1"/>
+          <w:rFonts w:ascii="Carlito" w:hAnsi="Carlito"/>
+          <w:sz w:val="22"/>
+        </w:rPr>
+        <w:t xml:space="preserve">Per-student counts</w:t>
+      </w:r>
+      <w:r>
+        <w:rPr>
+          <w:b w:val="0"/>
+          <w:rFonts w:ascii="Carlito" w:hAnsi="Carlito"/>
+          <w:sz w:val="22"/>
+        </w:rPr>
+        <w:t xml:space="preserve"> — a running total per student per exam, shown alongside the submission list so that an unusual attempt is visible without opening it.</w:t>
+      </w:r>
+    </w:p>
+    <w:p>
+      <w:pPr>
+        <w:pStyle w:val="ListBullet"/>
+        <w:spacing w:after="80"/>
+        <w:ind w:left="425"/>
+      </w:pPr>
+      <w:r>
+        <w:rPr>
+          <w:b w:val="1"/>
+          <w:rFonts w:ascii="Carlito" w:hAnsi="Carlito"/>
+          <w:sz w:val="22"/>
+        </w:rPr>
+        <w:t xml:space="preserve">The submission inspector</w:t>
+      </w:r>
+      <w:r>
+        <w:rPr>
+          <w:b w:val="0"/>
+          <w:rFonts w:ascii="Carlito" w:hAnsi="Carlito"/>
+          <w:sz w:val="22"/>
+        </w:rPr>
+        <w:t xml:space="preserve"> — the events for that student's attempt are shown beside the code at the moment the mark is being assigned.</w:t>
+      </w:r>
+    </w:p>
+    <w:p>
+      <w:pPr>
+        <w:spacing w:before="0" w:after="160"/>
+      </w:pPr>
+      <w:r>
+        <w:rPr>
+          <w:rFonts w:ascii="Carlito" w:hAnsi="Carlito"/>
+          <w:b w:val="0"/>
+          <w:i w:val="0"/>
+          <w:color w:val="000000"/>
+          <w:sz w:val="22"/>
+        </w:rPr>
+        <w:t xml:space="preserve">The presentation is deliberately evidential. LabSubmit shows a sequence of timestamped occurrences; it does not display a verdict, a score of suspicion or a recommendation. A student who left fullscreen once because a system notification stole focus looks different from a student who left it nine times, and the platform's job is to make that difference visible to a human rather than to decide it.</w:t>
+      </w:r>
+    </w:p>
+    <w:p>
+      <w:pPr>
+        <w:spacing w:before="200" w:after="100"/>
+      </w:pPr>
+      <w:r>
+        <w:rPr>
+          <w:rFonts w:ascii="Carlito" w:hAnsi="Carlito"/>
+          <w:b/>
+          <w:i w:val="0"/>
+          <w:color w:val="1F3A5F"/>
+          <w:sz w:val="23"/>
+        </w:rPr>
+        <w:t xml:space="preserve">8.5 What Secure Exam Mode does not do</w:t>
+      </w:r>
+    </w:p>
+    <w:p>
+      <w:pPr>
+        <w:spacing w:before="0" w:after="160"/>
+      </w:pPr>
+      <w:r>
+        <w:rPr>
+          <w:rFonts w:ascii="Carlito" w:hAnsi="Carlito"/>
+          <w:b w:val="0"/>
+          <w:i w:val="0"/>
+          <w:color w:val="000000"/>
+          <w:sz w:val="22"/>
+        </w:rPr>
+        <w:t xml:space="preserve">A web application cannot reliably control the Windows operating system. Secure Exam Mode therefore makes none of the following claims:</w:t>
+      </w:r>
+    </w:p>
+    <w:p>
+      <w:pPr>
+        <w:pStyle w:val="ListBullet"/>
+        <w:spacing w:after="80"/>
+        <w:ind w:left="425"/>
+      </w:pPr>
+      <w:r>
+        <w:rPr>
+          <w:b w:val="1"/>
+          <w:rFonts w:ascii="Carlito" w:hAnsi="Carlito"/>
+          <w:sz w:val="22"/>
+        </w:rPr>
+        <w:t xml:space="preserve">It does not lock the student's computer.</w:t>
+      </w:r>
+      <w:r>
+        <w:rPr>
+          <w:b w:val="0"/>
+          <w:rFonts w:ascii="Carlito" w:hAnsi="Carlito"/>
+          <w:sz w:val="22"/>
+        </w:rPr>
+        <w:t xml:space="preserve"> The machine remains fully under the student's control outside the browser.</w:t>
+      </w:r>
+    </w:p>
+    <w:p>
+      <w:pPr>
+        <w:pStyle w:val="ListBullet"/>
+        <w:spacing w:after="80"/>
+        <w:ind w:left="425"/>
+      </w:pPr>
+      <w:r>
+        <w:rPr>
+          <w:b w:val="1"/>
+          <w:rFonts w:ascii="Carlito" w:hAnsi="Carlito"/>
+          <w:sz w:val="22"/>
+        </w:rPr>
+        <w:t xml:space="preserve">It does not prevent Alt + Tab or Windows + Tab.</w:t>
+      </w:r>
+      <w:r>
+        <w:rPr>
+          <w:b w:val="0"/>
+          <w:rFonts w:ascii="Carlito" w:hAnsi="Carlito"/>
+          <w:sz w:val="22"/>
+        </w:rPr>
+        <w:t xml:space="preserve"> Switching away is detected and recorded; it is not prevented.</w:t>
+      </w:r>
+    </w:p>
+    <w:p>
+      <w:pPr>
+        <w:pStyle w:val="ListBullet"/>
+        <w:spacing w:after="80"/>
+        <w:ind w:left="425"/>
+      </w:pPr>
+      <w:r>
+        <w:rPr>
+          <w:b w:val="1"/>
+          <w:rFonts w:ascii="Carlito" w:hAnsi="Carlito"/>
+          <w:sz w:val="22"/>
+        </w:rPr>
+        <w:t xml:space="preserve">It does not block screenshots or screen recording.</w:t>
+      </w:r>
+      <w:r>
+        <w:rPr>
+          <w:b w:val="0"/>
+          <w:rFonts w:ascii="Carlito" w:hAnsi="Carlito"/>
+          <w:sz w:val="22"/>
+        </w:rPr>
+        <w:t xml:space="preserve"> Neither is visible to a web page.</w:t>
+      </w:r>
+    </w:p>
+    <w:p>
+      <w:pPr>
+        <w:pStyle w:val="ListBullet"/>
+        <w:spacing w:after="80"/>
+        <w:ind w:left="425"/>
+      </w:pPr>
+      <w:r>
+        <w:rPr>
+          <w:b w:val="1"/>
+          <w:rFonts w:ascii="Carlito" w:hAnsi="Carlito"/>
+          <w:sz w:val="22"/>
+        </w:rPr>
+        <w:t xml:space="preserve">It does not prevent the use of a second device or a mobile phone.</w:t>
+      </w:r>
+      <w:r>
+        <w:rPr>
+          <w:b w:val="0"/>
+          <w:rFonts w:ascii="Carlito" w:hAnsi="Carlito"/>
+          <w:sz w:val="22"/>
+        </w:rPr>
+        <w:t xml:space="preserve"> Nothing that happens off the examination machine is within reach.</w:t>
+      </w:r>
+    </w:p>
+    <w:p>
+      <w:pPr>
+        <w:pStyle w:val="ListBullet"/>
+        <w:spacing w:after="80"/>
+        <w:ind w:left="425"/>
+      </w:pPr>
+      <w:r>
+        <w:rPr>
+          <w:b w:val="1"/>
+          <w:rFonts w:ascii="Carlito" w:hAnsi="Carlito"/>
+          <w:sz w:val="22"/>
+        </w:rPr>
+        <w:t xml:space="preserve">It does not restrict Task Manager, USB devices or other applications.</w:t>
+      </w:r>
+      <w:r>
+        <w:rPr>
+          <w:b w:val="0"/>
+          <w:rFonts w:ascii="Carlito" w:hAnsi="Carlito"/>
+          <w:sz w:val="22"/>
+        </w:rPr>
+        <w:t xml:space="preserve"> These are operating-system concerns.</w:t>
+      </w:r>
+    </w:p>
+    <w:p>
+      <w:pPr>
+        <w:pStyle w:val="ListBullet"/>
+        <w:spacing w:after="80"/>
+        <w:ind w:left="425"/>
+      </w:pPr>
+      <w:r>
+        <w:rPr>
+          <w:b w:val="1"/>
+          <w:rFonts w:ascii="Carlito" w:hAnsi="Carlito"/>
+          <w:sz w:val="22"/>
+        </w:rPr>
+        <w:t xml:space="preserve">It does not use a camera, microphone or screen capture.</w:t>
+      </w:r>
+      <w:r>
+        <w:rPr>
+          <w:b w:val="0"/>
+          <w:rFonts w:ascii="Carlito" w:hAnsi="Carlito"/>
+          <w:sz w:val="22"/>
+        </w:rPr>
+        <w:t xml:space="preserve"> No biometric or visual surveillance of any kind is performed.</w:t>
+      </w:r>
+    </w:p>
+    <w:p>
+      <w:pPr>
+        <w:spacing w:before="0" w:after="160"/>
+      </w:pPr>
+      <w:r>
+        <w:rPr>
+          <w:rFonts w:ascii="Carlito" w:hAnsi="Carlito"/>
+          <w:b w:val="0"/>
+          <w:i w:val="0"/>
+          <w:color w:val="000000"/>
+          <w:sz w:val="22"/>
+        </w:rPr>
+        <w:t xml:space="preserve">What it does do is close the routes that run through the browser itself, make the exam session impossible to manipulate from the client, detect when a student leaves the examination window, and record each occurrence for review. It supplements invigilation; it does not replace it. Stronger restrictions require the Secure Exam Client described in Section 18.</w:t>
+      </w:r>
+    </w:p>
+    <w:p/>
+    <w:p>
+      <w:pPr>
+        <w:spacing w:before="280" w:after="120"/>
+      </w:pPr>
+      <w:r>
+        <w:rPr>
+          <w:rFonts w:ascii="Carlito" w:hAnsi="Carlito"/>
+          <w:b/>
+          <w:i w:val="0"/>
+          <w:color w:val="1F3A5F"/>
+          <w:sz w:val="26"/>
+        </w:rPr>
+        <w:t xml:space="preserve">9. System Architecture &amp; Technology Stack</w:t>
+      </w:r>
+    </w:p>
+    <w:p>
+      <w:pPr>
+        <w:spacing w:before="0" w:after="160"/>
+      </w:pPr>
+      <w:r>
+        <w:rPr>
+          <w:rFonts w:ascii="Carlito" w:hAnsi="Carlito"/>
+          <w:b w:val="0"/>
+          <w:i w:val="0"/>
+          <w:color w:val="000000"/>
+          <w:sz w:val="22"/>
+        </w:rPr>
+        <w:t xml:space="preserve">LabSubmit is built as a modern, self-hostable web application using open-source technologies throughout, with no licensing cost to the institution. Roles enter through a single web application; every action that affects an examination passes through the Secure Exam Session boundary, where the Exam Integrity Engine and the Exam Engine sit behind a backend API that re-authorises each request before it reaches the database.</w:t>
       </w:r>
     </w:p>
     <w:tbl>
@@ -1773,6 +4130,118 @@
           </w:p>
         </w:tc>
       </w:tr>
+      <w:tr>
+        <w:trPr>
+          <w:cantSplit/>
+        </w:trPr>
+        <w:tc>
+          <w:tcPr>
+            <w:tcW w:type="dxa" w:w="2041"/>
+          </w:tcPr>
+          <w:p>
+            <w:pPr>
+              <w:spacing w:after="40" w:before="40"/>
+            </w:pPr>
+            <w:r>
+              <w:rPr>
+                <w:rFonts w:ascii="Carlito" w:hAnsi="Carlito"/>
+                <w:sz w:val="20"/>
+              </w:rPr>
+              <w:t xml:space="preserve">Exam Integrity</w:t>
+            </w:r>
+          </w:p>
+        </w:tc>
+        <w:tc>
+          <w:tcPr>
+            <w:tcW w:type="dxa" w:w="3685"/>
+          </w:tcPr>
+          <w:p>
+            <w:pPr>
+              <w:spacing w:after="40" w:before="40"/>
+            </w:pPr>
+            <w:r>
+              <w:rPr>
+                <w:rFonts w:ascii="Carlito" w:hAnsi="Carlito"/>
+                <w:sz w:val="20"/>
+              </w:rPr>
+              <w:t xml:space="preserve">ExamGuard, AntiCheatWrapper, ExamViolation event store</w:t>
+            </w:r>
+          </w:p>
+        </w:tc>
+        <w:tc>
+          <w:tcPr>
+            <w:tcW w:type="dxa" w:w="3969"/>
+          </w:tcPr>
+          <w:p>
+            <w:pPr>
+              <w:spacing w:after="40" w:before="40"/>
+            </w:pPr>
+            <w:r>
+              <w:rPr>
+                <w:rFonts w:ascii="Carlito" w:hAnsi="Carlito"/>
+                <w:sz w:val="20"/>
+              </w:rPr>
+              <w:t xml:space="preserve">Secure Exam Mode monitoring, restriction and integrity event recording</w:t>
+            </w:r>
+          </w:p>
+        </w:tc>
+      </w:tr>
+      <w:tr>
+        <w:trPr>
+          <w:cantSplit/>
+        </w:trPr>
+        <w:tc>
+          <w:tcPr>
+            <w:tcW w:type="dxa" w:w="2041"/>
+          </w:tcPr>
+          <w:p>
+            <w:pPr>
+              <w:spacing w:after="40" w:before="40"/>
+            </w:pPr>
+            <w:r>
+              <w:rPr>
+                <w:rFonts w:ascii="Carlito" w:hAnsi="Carlito"/>
+                <w:sz w:val="20"/>
+              </w:rPr>
+              <w:t xml:space="preserve">Exam Session Control</w:t>
+            </w:r>
+          </w:p>
+        </w:tc>
+        <w:tc>
+          <w:tcPr>
+            <w:tcW w:type="dxa" w:w="3685"/>
+          </w:tcPr>
+          <w:p>
+            <w:pPr>
+              <w:spacing w:after="40" w:before="40"/>
+            </w:pPr>
+            <w:r>
+              <w:rPr>
+                <w:rFonts w:ascii="Carlito" w:hAnsi="Carlito"/>
+                <w:sz w:val="20"/>
+              </w:rPr>
+              <w:t xml:space="preserve">Server-side exam timing, authorisation and submission services</w:t>
+            </w:r>
+          </w:p>
+        </w:tc>
+        <w:tc>
+          <w:tcPr>
+            <w:tcW w:type="dxa" w:w="3969"/>
+          </w:tcPr>
+          <w:p>
+            <w:pPr>
+              <w:spacing w:after="40" w:before="40"/>
+            </w:pPr>
+            <w:r>
+              <w:rPr>
+                <w:rFonts w:ascii="Carlito" w:hAnsi="Carlito"/>
+                <w:sz w:val="20"/>
+              </w:rPr>
+              <w:t xml:space="preserve">Server-authoritative deadline, attempt state, one-submission locking</w:t>
+            </w:r>
+          </w:p>
+        </w:tc>
+      </w:tr>
     </w:tbl>
     <w:p>
       <w:pPr>
@@ -1791,7 +4260,7 @@
           <w:color w:val="1F3A5F"/>
           <w:sz w:val="26"/>
         </w:rPr>
-        <w:t>8. How LabSubmit Is Used at CBIT</w:t>
+        <w:t xml:space="preserve">10. How LabSubmit Is Used at CBIT</w:t>
       </w:r>
     </w:p>
     <w:p>
@@ -1862,7 +4331,7 @@
           <w:rFonts w:ascii="Carlito" w:hAnsi="Carlito"/>
           <w:sz w:val="22"/>
         </w:rPr>
-        <w:t>During the scheduled lab session, students log in, open the assigned lab, and write and test their code in the in-browser IDE, compiling and running it live against the platform's execution engine, with anti-cheat protections active throughout to preserve assessment integrity.</w:t>
+        <w:t xml:space="preserve">During the scheduled examination, students log in, open the assigned exam and start it explicitly. The server creates the attempt and begins the countdown, fullscreen is requested, and Secure Exam Mode monitors the session while the student writes and tests code in the in-browser IDE, compiling and running it live against the platform's execution engine.</w:t>
       </w:r>
     </w:p>
     <w:p>
@@ -1876,7 +4345,7 @@
           <w:rFonts w:ascii="Carlito" w:hAnsi="Carlito"/>
           <w:sz w:val="22"/>
         </w:rPr>
-        <w:t>Students submit their work; the workspace locks automatically so it cannot be edited after the deadline.</w:t>
+        <w:t xml:space="preserve">Students submit their work. The workspace locks automatically — on the student's own submission, at the server-side deadline, or on crossing the fullscreen-exit threshold the lecturer set — so that it cannot be edited afterwards.</w:t>
       </w:r>
     </w:p>
     <w:p>
@@ -1890,7 +4359,7 @@
           <w:rFonts w:ascii="Carlito" w:hAnsi="Carlito"/>
           <w:sz w:val="22"/>
         </w:rPr>
-        <w:t>The Lecturer reviews submissions in the grading panel, re-runs code where needed, assigns marks and remarks, sets an evaluation status, and publishes grades — or reopens the workspace if a student needs to correct and resubmit.</w:t>
+        <w:t xml:space="preserve">The Lecturer reviews submissions in the grading panel with the integrity log for that attempt beside the code, re-runs the submission where needed, assigns marks and remarks, sets an evaluation status and publishes grades — or reopens the workspace if a student needs to correct and resubmit.</w:t>
       </w:r>
     </w:p>
     <w:p>
@@ -1933,7 +4402,7 @@
           <w:color w:val="000000"/>
           <w:sz w:val="22"/>
         </w:rPr>
-        <w:t>In practice, this means a lab session that currently depends on pen drives, email, and a lecturer's personal machine to compile code is instead run entirely through one platform that already reflects CBIT's roll-number and section structure — from registration through to final grade publication.</w:t>
+        <w:t xml:space="preserve">In practice, this means a lab examination that currently depends on pen drives, email and a lecturer's personal machine to compile code is instead run entirely through one platform that already reflects CBIT's roll-number and section structure — from registration, through a monitored and server-timed examination, to final grade publication with an audit trail behind it.</w:t>
       </w:r>
     </w:p>
     <w:p>
@@ -1948,7 +4417,7 @@
           <w:color w:val="1F3A5F"/>
           <w:sz w:val="26"/>
         </w:rPr>
-        <w:t>9. Implementation &amp; Deployment Plan</w:t>
+        <w:t xml:space="preserve">11. Implementation &amp; Deployment Plan</w:t>
       </w:r>
     </w:p>
     <w:p>
@@ -1970,7 +4439,7 @@
           <w:rFonts w:ascii="Carlito" w:hAnsi="Carlito"/>
           <w:sz w:val="22"/>
         </w:rPr>
-        <w:t xml:space="preserve"> — Deploy for one section (e.g., CSE – IoT &amp; CSBCT, 2nd year) for a single lab course, on the existing live deployment (Section 12) — requiring no college server, no procurement, and no setup cost.</w:t>
+        <w:t xml:space="preserve"> — Deploy for one section (e.g., CSE – IoT &amp; CSBCT, 2nd year) for a single lab course, on the existing live deployment (Section 14) — requiring no college server, no procurement, and no setup cost.</w:t>
       </w:r>
     </w:p>
     <w:p>
@@ -2036,7 +4505,7 @@
           <w:rFonts w:ascii="Carlito" w:hAnsi="Carlito"/>
           <w:sz w:val="22"/>
         </w:rPr>
-        <w:t xml:space="preserve"> — Rollout: expand to additional sections and years based on pilot results, moving to the paid hosting tier or to college infrastructure as set out in Section 13.3.</w:t>
+        <w:t xml:space="preserve"> — Rollout: expand to additional sections and years based on pilot results, moving to the paid hosting tier or to college infrastructure as set out in Section 15.3.</w:t>
       </w:r>
     </w:p>
     <w:p>
@@ -2058,7 +4527,7 @@
           <w:rFonts w:ascii="Carlito" w:hAnsi="Carlito"/>
           <w:sz w:val="22"/>
         </w:rPr>
-        <w:t xml:space="preserve"> — maintenance, support, and long-term continuity are addressed in Section 16. Lab computers require no compilers or software installation of any kind — everything runs in the browser.</w:t>
+        <w:t xml:space="preserve"> — maintenance, support, and long-term continuity are addressed in Section 19. Lab computers require no compilers or software installation of any kind — everything runs in the browser.</w:t>
       </w:r>
     </w:p>
     <w:p>
@@ -2073,7 +4542,22 @@
           <w:color w:val="1F3A5F"/>
           <w:sz w:val="26"/>
         </w:rPr>
-        <w:t>10. Benefits to the Institution</w:t>
+        <w:t xml:space="preserve">12. Expected Impact &amp; Benefits</w:t>
+      </w:r>
+    </w:p>
+    <w:p>
+      <w:pPr>
+        <w:spacing w:before="0" w:after="160"/>
+      </w:pPr>
+      <w:r>
+        <w:rPr>
+          <w:b w:val="1"/>
+          <w:rFonts w:ascii="Carlito" w:hAnsi="Carlito"/>
+          <w:i w:val="0"/>
+          <w:color w:val="000000"/>
+          <w:sz w:val="22"/>
+        </w:rPr>
+        <w:t xml:space="preserve">For students</w:t>
       </w:r>
     </w:p>
     <w:p>
@@ -2084,18 +4568,19 @@
       </w:pPr>
       <w:r>
         <w:rPr>
-          <w:rFonts w:ascii="Carlito" w:hAnsi="Carlito"/>
-          <w:b/>
+          <w:b w:val="1"/>
+          <w:rFonts w:ascii="Carlito" w:hAnsi="Carlito"/>
           <w:sz w:val="22"/>
         </w:rPr>
-        <w:t>Operational efficiency</w:t>
-      </w:r>
-      <w:r>
-        <w:rPr>
+        <w:t xml:space="preserve">A structured examination experience</w:t>
+      </w:r>
+      <w:r>
+        <w:rPr>
+          <w:b w:val="0"/>
           <w:rFonts w:ascii="Carlito" w:hAnsi="Carlito"/>
           <w:sz w:val="22"/>
         </w:rPr>
-        <w:t xml:space="preserve"> — eliminates email and pen-drive-based submission handling, and removes the need for faculty to manually compile student code.</w:t>
+        <w:t xml:space="preserve"> — a clear pre-exam briefing, an explicit start, and rules that are stated before the attempt begins rather than discovered during it.</w:t>
       </w:r>
     </w:p>
     <w:p>
@@ -2106,18 +4591,19 @@
       </w:pPr>
       <w:r>
         <w:rPr>
-          <w:rFonts w:ascii="Carlito" w:hAnsi="Carlito"/>
-          <w:b/>
+          <w:b w:val="1"/>
+          <w:rFonts w:ascii="Carlito" w:hAnsi="Carlito"/>
           <w:sz w:val="22"/>
         </w:rPr>
-        <w:t>Academic integrity</w:t>
-      </w:r>
-      <w:r>
-        <w:rPr>
+        <w:t xml:space="preserve">A reliable timer</w:t>
+      </w:r>
+      <w:r>
+        <w:rPr>
+          <w:b w:val="0"/>
           <w:rFonts w:ascii="Carlito" w:hAnsi="Carlito"/>
           <w:sz w:val="22"/>
         </w:rPr>
-        <w:t xml:space="preserve"> — built-in safeguards reduce opportunities for copy and paste during timed assessments.</w:t>
+        <w:t xml:space="preserve"> — the countdown comes from the server, so a slow machine, a reloaded page or a background tab does not cost a student time.</w:t>
       </w:r>
     </w:p>
     <w:p>
@@ -2128,18 +4614,19 @@
       </w:pPr>
       <w:r>
         <w:rPr>
-          <w:rFonts w:ascii="Carlito" w:hAnsi="Carlito"/>
-          <w:b/>
+          <w:b w:val="1"/>
+          <w:rFonts w:ascii="Carlito" w:hAnsi="Carlito"/>
           <w:sz w:val="22"/>
         </w:rPr>
-        <w:t>Standardized grading</w:t>
-      </w:r>
-      <w:r>
-        <w:rPr>
+        <w:t xml:space="preserve">Transparent warnings</w:t>
+      </w:r>
+      <w:r>
+        <w:rPr>
+          <w:b w:val="0"/>
           <w:rFonts w:ascii="Carlito" w:hAnsi="Carlito"/>
           <w:sz w:val="22"/>
         </w:rPr>
-        <w:t xml:space="preserve"> — consistent marks, remarks, and status categories across sections and faculty.</w:t>
+        <w:t xml:space="preserve"> — restricted actions produce an immediate, readable message rather than silent failure, and the student can see their own fullscreen-exit count against the threshold.</w:t>
       </w:r>
     </w:p>
     <w:p>
@@ -2150,18 +4637,34 @@
       </w:pPr>
       <w:r>
         <w:rPr>
-          <w:rFonts w:ascii="Carlito" w:hAnsi="Carlito"/>
-          <w:b/>
+          <w:b w:val="1"/>
+          <w:rFonts w:ascii="Carlito" w:hAnsi="Carlito"/>
           <w:sz w:val="22"/>
         </w:rPr>
-        <w:t>Transparency for students</w:t>
-      </w:r>
-      <w:r>
-        <w:rPr>
+        <w:t xml:space="preserve">A stable submission process</w:t>
+      </w:r>
+      <w:r>
+        <w:rPr>
+          <w:b w:val="0"/>
           <w:rFonts w:ascii="Carlito" w:hAnsi="Carlito"/>
           <w:sz w:val="22"/>
         </w:rPr>
-        <w:t xml:space="preserve"> — students see results and feedback immediately instead of waiting on manually compiled spreadsheets.</w:t>
+        <w:t xml:space="preserve"> — one submission path, an explicit confirmation, and no dependence on a file transfer succeeding at the end of the period.</w:t>
+      </w:r>
+    </w:p>
+    <w:p>
+      <w:pPr>
+        <w:spacing w:before="0" w:after="160"/>
+      </w:pPr>
+      <w:r>
+        <w:rPr>
+          <w:b w:val="1"/>
+          <w:rFonts w:ascii="Carlito" w:hAnsi="Carlito"/>
+          <w:i w:val="0"/>
+          <w:color w:val="000000"/>
+          <w:sz w:val="22"/>
+        </w:rPr>
+        <w:t xml:space="preserve">For faculty</w:t>
       </w:r>
     </w:p>
     <w:p>
@@ -2172,18 +4675,19 @@
       </w:pPr>
       <w:r>
         <w:rPr>
-          <w:rFonts w:ascii="Carlito" w:hAnsi="Carlito"/>
-          <w:b/>
+          <w:b w:val="1"/>
+          <w:rFonts w:ascii="Carlito" w:hAnsi="Carlito"/>
           <w:sz w:val="22"/>
         </w:rPr>
-        <w:t>Administrative visibility</w:t>
-      </w:r>
-      <w:r>
-        <w:rPr>
+        <w:t xml:space="preserve">Centralised examination management</w:t>
+      </w:r>
+      <w:r>
+        <w:rPr>
+          <w:b w:val="0"/>
           <w:rFonts w:ascii="Carlito" w:hAnsi="Carlito"/>
           <w:sz w:val="22"/>
         </w:rPr>
-        <w:t xml:space="preserve"> — real-time, institution-wide visibility into lab performance and grading completion — useful for outcome-based accreditation reporting (NBA/NAAC).</w:t>
+        <w:t xml:space="preserve"> — authoring, scheduling, monitoring and grading in one panel, within their own sections.</w:t>
       </w:r>
     </w:p>
     <w:p>
@@ -2194,18 +4698,241 @@
       </w:pPr>
       <w:r>
         <w:rPr>
-          <w:rFonts w:ascii="Carlito" w:hAnsi="Carlito"/>
-          <w:b/>
+          <w:b w:val="1"/>
+          <w:rFonts w:ascii="Carlito" w:hAnsi="Carlito"/>
           <w:sz w:val="22"/>
         </w:rPr>
-        <w:t>Fits existing structure</w:t>
-      </w:r>
-      <w:r>
-        <w:rPr>
+        <w:t xml:space="preserve">Automatic execution where applicable</w:t>
+      </w:r>
+      <w:r>
+        <w:rPr>
+          <w:b w:val="0"/>
           <w:rFonts w:ascii="Carlito" w:hAnsi="Carlito"/>
           <w:sz w:val="22"/>
         </w:rPr>
-        <w:t xml:space="preserve"> — built around CBIT's existing roll-number, branch, and section structure, requiring no change to how students are already identified administratively.</w:t>
+        <w:t xml:space="preserve"> — submissions compile and run inside the platform, removing manual verification on a personal machine.</w:t>
+      </w:r>
+    </w:p>
+    <w:p>
+      <w:pPr>
+        <w:pStyle w:val="ListBullet"/>
+        <w:spacing w:after="80"/>
+        <w:ind w:left="425"/>
+      </w:pPr>
+      <w:r>
+        <w:rPr>
+          <w:b w:val="1"/>
+          <w:rFonts w:ascii="Carlito" w:hAnsi="Carlito"/>
+          <w:sz w:val="22"/>
+        </w:rPr>
+        <w:t xml:space="preserve">Integrity event visibility</w:t>
+      </w:r>
+      <w:r>
+        <w:rPr>
+          <w:b w:val="0"/>
+          <w:rFonts w:ascii="Carlito" w:hAnsi="Carlito"/>
+          <w:sz w:val="22"/>
+        </w:rPr>
+        <w:t xml:space="preserve"> — the events for an attempt are available at the moment the mark is being decided, not reconstructed afterwards.</w:t>
+      </w:r>
+    </w:p>
+    <w:p>
+      <w:pPr>
+        <w:pStyle w:val="ListBullet"/>
+        <w:spacing w:after="80"/>
+        <w:ind w:left="425"/>
+      </w:pPr>
+      <w:r>
+        <w:rPr>
+          <w:b w:val="1"/>
+          <w:rFonts w:ascii="Carlito" w:hAnsi="Carlito"/>
+          <w:sz w:val="22"/>
+        </w:rPr>
+        <w:t xml:space="preserve">Easier review of suspicious attempts</w:t>
+      </w:r>
+      <w:r>
+        <w:rPr>
+          <w:b w:val="0"/>
+          <w:rFonts w:ascii="Carlito" w:hAnsi="Carlito"/>
+          <w:sz w:val="22"/>
+        </w:rPr>
+        <w:t xml:space="preserve"> — a timestamped sequence per student replaces recollection and suspicion as the basis for a conversation with a student.</w:t>
+      </w:r>
+    </w:p>
+    <w:p>
+      <w:pPr>
+        <w:pStyle w:val="ListBullet"/>
+        <w:spacing w:after="80"/>
+        <w:ind w:left="425"/>
+      </w:pPr>
+      <w:r>
+        <w:rPr>
+          <w:b w:val="1"/>
+          <w:rFonts w:ascii="Carlito" w:hAnsi="Carlito"/>
+          <w:sz w:val="22"/>
+        </w:rPr>
+        <w:t xml:space="preserve">Standardised grading</w:t>
+      </w:r>
+      <w:r>
+        <w:rPr>
+          <w:b w:val="0"/>
+          <w:rFonts w:ascii="Carlito" w:hAnsi="Carlito"/>
+          <w:sz w:val="22"/>
+        </w:rPr>
+        <w:t xml:space="preserve"> — consistent marks, remarks and status categories across sections and faculty.</w:t>
+      </w:r>
+    </w:p>
+    <w:p>
+      <w:pPr>
+        <w:spacing w:before="0" w:after="160"/>
+      </w:pPr>
+      <w:r>
+        <w:rPr>
+          <w:b w:val="1"/>
+          <w:rFonts w:ascii="Carlito" w:hAnsi="Carlito"/>
+          <w:i w:val="0"/>
+          <w:color w:val="000000"/>
+          <w:sz w:val="22"/>
+        </w:rPr>
+        <w:t xml:space="preserve">For the institution</w:t>
+      </w:r>
+    </w:p>
+    <w:p>
+      <w:pPr>
+        <w:pStyle w:val="ListBullet"/>
+        <w:spacing w:after="80"/>
+        <w:ind w:left="425"/>
+      </w:pPr>
+      <w:r>
+        <w:rPr>
+          <w:b w:val="1"/>
+          <w:rFonts w:ascii="Carlito" w:hAnsi="Carlito"/>
+          <w:sz w:val="22"/>
+        </w:rPr>
+        <w:t xml:space="preserve">Scalable digital lab examinations</w:t>
+      </w:r>
+      <w:r>
+        <w:rPr>
+          <w:b w:val="0"/>
+          <w:rFonts w:ascii="Carlito" w:hAnsi="Carlito"/>
+          <w:sz w:val="22"/>
+        </w:rPr>
+        <w:t xml:space="preserve"> — the same platform runs one pilot section or several departments without changing how students are identified administratively.</w:t>
+      </w:r>
+    </w:p>
+    <w:p>
+      <w:pPr>
+        <w:pStyle w:val="ListBullet"/>
+        <w:spacing w:after="80"/>
+        <w:ind w:left="425"/>
+      </w:pPr>
+      <w:r>
+        <w:rPr>
+          <w:b w:val="1"/>
+          <w:rFonts w:ascii="Carlito" w:hAnsi="Carlito"/>
+          <w:sz w:val="22"/>
+        </w:rPr>
+        <w:t xml:space="preserve">Improved auditability</w:t>
+      </w:r>
+      <w:r>
+        <w:rPr>
+          <w:b w:val="0"/>
+          <w:rFonts w:ascii="Carlito" w:hAnsi="Carlito"/>
+          <w:sz w:val="22"/>
+        </w:rPr>
+        <w:t xml:space="preserve"> — submission timestamps, evaluation records and integrity events are retained and exportable.</w:t>
+      </w:r>
+    </w:p>
+    <w:p>
+      <w:pPr>
+        <w:pStyle w:val="ListBullet"/>
+        <w:spacing w:after="80"/>
+        <w:ind w:left="425"/>
+      </w:pPr>
+      <w:r>
+        <w:rPr>
+          <w:b w:val="1"/>
+          <w:rFonts w:ascii="Carlito" w:hAnsi="Carlito"/>
+          <w:sz w:val="22"/>
+        </w:rPr>
+        <w:t xml:space="preserve">Centralised assessment infrastructure</w:t>
+      </w:r>
+      <w:r>
+        <w:rPr>
+          <w:b w:val="0"/>
+          <w:rFonts w:ascii="Carlito" w:hAnsi="Carlito"/>
+          <w:sz w:val="22"/>
+        </w:rPr>
+        <w:t xml:space="preserve"> — one system replaces email, pen drives and spreadsheets across every lab session.</w:t>
+      </w:r>
+    </w:p>
+    <w:p>
+      <w:pPr>
+        <w:pStyle w:val="ListBullet"/>
+        <w:spacing w:after="80"/>
+        <w:ind w:left="425"/>
+      </w:pPr>
+      <w:r>
+        <w:rPr>
+          <w:b w:val="1"/>
+          <w:rFonts w:ascii="Carlito" w:hAnsi="Carlito"/>
+          <w:sz w:val="22"/>
+        </w:rPr>
+        <w:t xml:space="preserve">Accreditation reporting</w:t>
+      </w:r>
+      <w:r>
+        <w:rPr>
+          <w:b w:val="0"/>
+          <w:rFonts w:ascii="Carlito" w:hAnsi="Carlito"/>
+          <w:sz w:val="22"/>
+        </w:rPr>
+        <w:t xml:space="preserve"> — real-time visibility into lab performance and grading completion, useful for outcome-based NBA / NAAC reporting.</w:t>
+      </w:r>
+    </w:p>
+    <w:p>
+      <w:pPr>
+        <w:pStyle w:val="ListBullet"/>
+        <w:spacing w:after="80"/>
+        <w:ind w:left="425"/>
+      </w:pPr>
+      <w:r>
+        <w:rPr>
+          <w:b w:val="1"/>
+          <w:rFonts w:ascii="Carlito" w:hAnsi="Carlito"/>
+          <w:sz w:val="22"/>
+        </w:rPr>
+        <w:t xml:space="preserve">A foundation for secure kiosk-based examinations</w:t>
+      </w:r>
+      <w:r>
+        <w:rPr>
+          <w:b w:val="0"/>
+          <w:rFonts w:ascii="Carlito" w:hAnsi="Carlito"/>
+          <w:sz w:val="22"/>
+        </w:rPr>
+        <w:t xml:space="preserve"> — the server-authoritative session model is the prerequisite for the Secure Exam Client described in Section 18, so the work done now is not discarded later.</w:t>
+      </w:r>
+    </w:p>
+    <w:p>
+      <w:pPr>
+        <w:pStyle w:val="ListBullet"/>
+        <w:spacing w:after="80"/>
+        <w:ind w:left="425"/>
+      </w:pPr>
+      <w:r>
+        <w:rPr>
+          <w:b w:val="1"/>
+          <w:rFonts w:ascii="Carlito" w:hAnsi="Carlito"/>
+          <w:sz w:val="22"/>
+        </w:rPr>
+        <w:t xml:space="preserve">No change to existing structure</w:t>
+      </w:r>
+      <w:r>
+        <w:rPr>
+          <w:b w:val="0"/>
+          <w:rFonts w:ascii="Carlito" w:hAnsi="Carlito"/>
+          <w:sz w:val="22"/>
+        </w:rPr>
+        <w:t xml:space="preserve"> — built around CBIT's existing roll-number, branch and section structure.</w:t>
       </w:r>
     </w:p>
     <w:p>
@@ -2220,7 +4947,7 @@
           <w:color w:val="1F3A5F"/>
           <w:sz w:val="26"/>
         </w:rPr>
-        <w:t>11. Feasibility &amp; Resource Requirements</w:t>
+        <w:t xml:space="preserve">13. Feasibility &amp; Resource Requirements</w:t>
       </w:r>
     </w:p>
     <w:p>
@@ -2264,7 +4991,7 @@
           <w:rFonts w:ascii="Carlito" w:hAnsi="Carlito"/>
           <w:sz w:val="22"/>
         </w:rPr>
-        <w:t xml:space="preserve"> — already live on cloud hosting (see Section 12). The same Docker image runs unchanged on a college server or VM with GCC, G++, JDK 17+, Python 3, and Node.js installed — see Section 13.3 for the cost comparison.</w:t>
+        <w:t xml:space="preserve"> — already live on cloud hosting (see Section 14). The same Docker image runs unchanged on a college server or VM with GCC, G++, JDK 17+, Python 3, and Node.js installed — see Section 15.3 for the cost comparison.</w:t>
       </w:r>
     </w:p>
     <w:p>
@@ -2308,7 +5035,7 @@
           <w:rFonts w:ascii="Carlito" w:hAnsi="Carlito"/>
           <w:sz w:val="22"/>
         </w:rPr>
-        <w:t xml:space="preserve"> — built entirely on open-source frameworks (Next.js, Prisma, Monaco Editor) — no licensing fees. Infrastructure costs are set out in full in Section 13.</w:t>
+        <w:t xml:space="preserve"> — built entirely on open-source frameworks (Next.js, Prisma, Monaco Editor) — no licensing fees. Infrastructure costs are set out in full in Section 15.</w:t>
       </w:r>
     </w:p>
     <w:p>
@@ -2345,7 +5072,7 @@
           <w:color w:val="1F3A5F"/>
           <w:sz w:val="26"/>
         </w:rPr>
-        <w:t>12. Live Deployment &amp; Access</w:t>
+        <w:t xml:space="preserve">14. Live Deployment &amp; Access</w:t>
       </w:r>
     </w:p>
     <w:p>
@@ -2731,7 +5458,7 @@
           <w:color w:val="000000"/>
           <w:sz w:val="22"/>
         </w:rPr>
-        <w:t>The current deployment runs on free and entry-tier plans, at no cost to the institution. It is fully functional for demonstration and for a supervised pilot. Section 13 sets out what it would cost to run at department scale, and Section 15 is candid about what the free tier does not guarantee.</w:t>
+        <w:t>The current deployment runs on free and entry-tier plans, at no cost to the institution. It is fully functional for demonstration and for a supervised pilot. Section 15 sets out what it would cost to run at department scale, and Section 17 is candid about what the free tier does not guarantee.</w:t>
       </w:r>
     </w:p>
     <w:p>
@@ -2746,7 +5473,7 @@
           <w:color w:val="1F3A5F"/>
           <w:sz w:val="26"/>
         </w:rPr>
-        <w:t>13. Budget &amp; Cost Analysis</w:t>
+        <w:t xml:space="preserve">15. Budget &amp; Cost Analysis</w:t>
       </w:r>
     </w:p>
     <w:p>
@@ -2791,7 +5518,7 @@
           <w:color w:val="1F3A5F"/>
           <w:sz w:val="23"/>
         </w:rPr>
-        <w:t>13.1 Phase 1 — Pilot (one section, one semester)</w:t>
+        <w:t xml:space="preserve">15.1 Phase 1 — Pilot (one section, one semester)</w:t>
       </w:r>
     </w:p>
     <w:p>
@@ -3375,7 +6102,7 @@
           <w:color w:val="595959"/>
           <w:sz w:val="17"/>
         </w:rPr>
-        <w:t>The pilot can also be run entirely on trial credit at ₹0, accepting the idle-restart delay noted in Section 15.</w:t>
+        <w:t>The pilot can also be run entirely on trial credit at ₹0, accepting the idle-restart delay noted in Section 17.</w:t>
       </w:r>
     </w:p>
     <w:p>
@@ -3390,7 +6117,7 @@
           <w:color w:val="1F3A5F"/>
           <w:sz w:val="23"/>
         </w:rPr>
-        <w:t>13.2 Phase 2 — Department-wide deployment (annual infrastructure)</w:t>
+        <w:t xml:space="preserve">15.2 Phase 2 — Department-wide deployment (annual infrastructure)</w:t>
       </w:r>
     </w:p>
     <w:p>
@@ -4427,7 +7154,7 @@
           <w:color w:val="1F3A5F"/>
           <w:sz w:val="23"/>
         </w:rPr>
-        <w:t>13.3 Three-year projection</w:t>
+        <w:t xml:space="preserve">15.3 Three-year projection</w:t>
       </w:r>
     </w:p>
     <w:p>
@@ -5527,7 +8254,7 @@
           <w:color w:val="1F3A5F"/>
           <w:sz w:val="23"/>
         </w:rPr>
-        <w:t>13.4 What the budget deliberately does not include</w:t>
+        <w:t xml:space="preserve">15.4 What the budget deliberately does not include</w:t>
       </w:r>
     </w:p>
     <w:p>
@@ -5704,7 +8431,7 @@
           <w:color w:val="1F3A5F"/>
           <w:sz w:val="26"/>
         </w:rPr>
-        <w:t>14. Data Security, Privacy &amp; Ownership</w:t>
+        <w:t xml:space="preserve">16. Data Security, Privacy &amp; Ownership</w:t>
       </w:r>
     </w:p>
     <w:p>
@@ -5796,18 +8523,19 @@
       </w:pPr>
       <w:r>
         <w:rPr>
-          <w:rFonts w:ascii="Carlito" w:hAnsi="Carlito"/>
-          <w:b/>
+          <w:b w:val="1"/>
+          <w:rFonts w:ascii="Carlito" w:hAnsi="Carlito"/>
           <w:sz w:val="22"/>
         </w:rPr>
-        <w:t>Execution authorisation</w:t>
-      </w:r>
-      <w:r>
-        <w:rPr>
+        <w:t xml:space="preserve">Execution authorisation</w:t>
+      </w:r>
+      <w:r>
+        <w:rPr>
+          <w:b w:val="0"/>
           <w:rFonts w:ascii="Carlito" w:hAnsi="Carlito"/>
           <w:sz w:val="22"/>
         </w:rPr>
-        <w:t xml:space="preserve"> — before any code is compiled, the server independently verifies the student's identity, that they own the workspace, and that the assessment window is open. The browser is treated as untrusted throughout.</w:t>
+        <w:t xml:space="preserve"> — before any code is compiled, the server independently verifies the student's identity, that they own the workspace, that the examination window is open and that the deadline has not passed. The browser is treated as untrusted throughout.</w:t>
       </w:r>
     </w:p>
     <w:p>
@@ -5818,18 +8546,19 @@
       </w:pPr>
       <w:r>
         <w:rPr>
-          <w:rFonts w:ascii="Carlito" w:hAnsi="Carlito"/>
-          <w:b/>
+          <w:b w:val="1"/>
+          <w:rFonts w:ascii="Carlito" w:hAnsi="Carlito"/>
           <w:sz w:val="22"/>
         </w:rPr>
-        <w:t>Data ownership</w:t>
-      </w:r>
-      <w:r>
-        <w:rPr>
+        <w:t xml:space="preserve">Server-authoritative exam state</w:t>
+      </w:r>
+      <w:r>
+        <w:rPr>
+          <w:b w:val="0"/>
           <w:rFonts w:ascii="Carlito" w:hAnsi="Carlito"/>
           <w:sz w:val="22"/>
         </w:rPr>
-        <w:t xml:space="preserve"> — all data belongs to CBIT. There is no third-party analytics, no advertising, no data sharing, and no external processing beyond the hosting providers themselves.</w:t>
+        <w:t xml:space="preserve"> — the examination deadline, the attempt state and the submission are computed and enforced by the backend. Values sent by the browser are never accepted as authoritative, so exam state cannot be altered from the client.</w:t>
       </w:r>
     </w:p>
     <w:p>
@@ -5840,10 +8569,78 @@
       </w:pPr>
       <w:r>
         <w:rPr>
+          <w:b w:val="1"/>
+          <w:rFonts w:ascii="Carlito" w:hAnsi="Carlito"/>
+          <w:sz w:val="22"/>
+        </w:rPr>
+        <w:t xml:space="preserve">Integrity event retention</w:t>
+      </w:r>
+      <w:r>
+        <w:rPr>
+          <w:b w:val="0"/>
+          <w:rFonts w:ascii="Carlito" w:hAnsi="Carlito"/>
+          <w:sz w:val="22"/>
+        </w:rPr>
+        <w:t xml:space="preserve"> — integrity events are written with a server-side timestamp and retained beyond submission, so a decision about a student can be revisited with the full sequence available.</w:t>
+      </w:r>
+    </w:p>
+    <w:p>
+      <w:pPr>
+        <w:pStyle w:val="ListBullet"/>
+        <w:spacing w:after="80"/>
+        <w:ind w:left="425"/>
+      </w:pPr>
+      <w:r>
+        <w:rPr>
+          <w:b w:val="1"/>
+          <w:rFonts w:ascii="Carlito" w:hAnsi="Carlito"/>
+          <w:sz w:val="22"/>
+        </w:rPr>
+        <w:t xml:space="preserve">Monitoring scope and student privacy</w:t>
+      </w:r>
+      <w:r>
+        <w:rPr>
+          <w:b w:val="0"/>
+          <w:rFonts w:ascii="Carlito" w:hAnsi="Carlito"/>
+          <w:sz w:val="22"/>
+        </w:rPr>
+        <w:t xml:space="preserve"> — Secure Exam Mode captures interaction metadata only: which browser events occurred and when. No camera, microphone, screen capture, keystroke content or personal file access is used anywhere in the platform.</w:t>
+      </w:r>
+    </w:p>
+    <w:p>
+      <w:pPr>
+        <w:pStyle w:val="ListBullet"/>
+        <w:spacing w:after="80"/>
+        <w:ind w:left="425"/>
+      </w:pPr>
+      <w:r>
+        <w:rPr>
           <w:rFonts w:ascii="Carlito" w:hAnsi="Carlito"/>
           <w:b/>
           <w:sz w:val="22"/>
         </w:rPr>
+        <w:t>Data ownership</w:t>
+      </w:r>
+      <w:r>
+        <w:rPr>
+          <w:rFonts w:ascii="Carlito" w:hAnsi="Carlito"/>
+          <w:sz w:val="22"/>
+        </w:rPr>
+        <w:t xml:space="preserve"> — all data belongs to CBIT. There is no third-party analytics, no advertising, no data sharing, and no external processing beyond the hosting providers themselves.</w:t>
+      </w:r>
+    </w:p>
+    <w:p>
+      <w:pPr>
+        <w:pStyle w:val="ListBullet"/>
+        <w:spacing w:after="80"/>
+        <w:ind w:left="425"/>
+      </w:pPr>
+      <w:r>
+        <w:rPr>
+          <w:rFonts w:ascii="Carlito" w:hAnsi="Carlito"/>
+          <w:b/>
+          <w:sz w:val="22"/>
+        </w:rPr>
         <w:t>Data residency</w:t>
       </w:r>
       <w:r>
@@ -5851,7 +8648,7 @@
           <w:rFonts w:ascii="Carlito" w:hAnsi="Carlito"/>
           <w:sz w:val="22"/>
         </w:rPr>
-        <w:t xml:space="preserve"> — under the college-hosted option in Section 13.3, all student data remains on campus infrastructure and never leaves the institution.</w:t>
+        <w:t xml:space="preserve"> — under the college-hosted option in Section 15.3, all student data remains on campus infrastructure and never leaves the institution.</w:t>
       </w:r>
     </w:p>
     <w:p>
@@ -5910,7 +8707,7 @@
           <w:color w:val="1F3A5F"/>
           <w:sz w:val="26"/>
         </w:rPr>
-        <w:t>15. Risks, Limitations &amp; Mitigation</w:t>
+        <w:t xml:space="preserve">17. Risks, Limitations &amp; Mitigation</w:t>
       </w:r>
     </w:p>
     <w:p>
@@ -6171,7 +8968,7 @@
                 <w:rFonts w:ascii="Carlito" w:hAnsi="Carlito"/>
                 <w:sz w:val="19"/>
               </w:rPr>
-              <w:t>Paid plans are budgeted in Section 13.2 before the platform carries any graded assessment.</w:t>
+              <w:t>Paid plans are budgeted in Section 15.2 before the platform carries any graded assessment.</w:t>
             </w:r>
           </w:p>
         </w:tc>
@@ -6194,7 +8991,7 @@
                 <w:rFonts w:ascii="Carlito" w:hAnsi="Carlito"/>
                 <w:sz w:val="19"/>
               </w:rPr>
-              <w:t>Anti-cheat is browser-level only</w:t>
+              <w:t xml:space="preserve">Secure Exam Mode is browser-level, not OS-level</w:t>
             </w:r>
           </w:p>
         </w:tc>
@@ -6212,7 +9009,7 @@
                 <w:rFonts w:ascii="Carlito" w:hAnsi="Carlito"/>
                 <w:sz w:val="19"/>
               </w:rPr>
-              <w:t>Copy, paste, right-click and shortcuts are blocked in the editor, but a determined student can use a second device.</w:t>
+              <w:t xml:space="preserve">Fullscreen, focus, visibility, clipboard and context-menu behaviour are monitored and restricted inside the browser, but the platform cannot control the operating system. Alt + Tab, Windows + Tab, Task Manager, screenshots, screen recording, USB devices, a second computer and a mobile phone all remain outside its reach.</w:t>
             </w:r>
           </w:p>
         </w:tc>
@@ -6230,7 +9027,7 @@
                 <w:rFonts w:ascii="Carlito" w:hAnsi="Carlito"/>
                 <w:sz w:val="19"/>
               </w:rPr>
-              <w:t>The platform supplements invigilation, it does not replace it. Fullscreen-exit counts are recorded and flagged to the lecturer.</w:t>
+              <w:t xml:space="preserve">The platform supplements invigilation, it does not replace it. Every browser-level event is recorded with a timestamp for faculty review, and fullscreen-exit counts are surfaced against a faculty-set threshold. A dedicated LabSubmit Secure Exam Client providing OS-level lockdown is proposed as future work in Section 18.</w:t>
             </w:r>
           </w:p>
         </w:tc>
@@ -6286,7 +9083,7 @@
                 <w:rFonts w:ascii="Carlito" w:hAnsi="Carlito"/>
                 <w:sz w:val="19"/>
               </w:rPr>
-              <w:t>Source code, schema, and deployment documentation are handed to the department — see Section 16.</w:t>
+              <w:t>Source code, schema, and deployment documentation are handed to the department — see Section 19.</w:t>
             </w:r>
           </w:p>
         </w:tc>
@@ -6368,7 +9165,7 @@
           <w:color w:val="1F3A5F"/>
           <w:sz w:val="26"/>
         </w:rPr>
-        <w:t>16. Maintenance, Support &amp; Continuity</w:t>
+        <w:t xml:space="preserve">18. Future Scope</w:t>
       </w:r>
     </w:p>
     <w:p>
@@ -6383,7 +9180,37 @@
           <w:color w:val="000000"/>
           <w:sz w:val="22"/>
         </w:rPr>
-        <w:t>A fair question about any student-built system is what happens when the student graduates. It is answered directly here rather than left for the committee to raise.</w:t>
+        <w:t xml:space="preserve">The work below is not implemented. It is set out here so that the scope of what exists today is not misread, and so that the committee can see that the platform has a coherent direction rather than a fixed ceiling.</w:t>
+      </w:r>
+    </w:p>
+    <w:p>
+      <w:pPr>
+        <w:spacing w:before="200" w:after="100"/>
+      </w:pPr>
+      <w:r>
+        <w:rPr>
+          <w:rFonts w:ascii="Carlito" w:hAnsi="Carlito"/>
+          <w:b/>
+          <w:i w:val="0"/>
+          <w:color w:val="1F3A5F"/>
+          <w:sz w:val="23"/>
+        </w:rPr>
+        <w:t xml:space="preserve">18.1 LabSubmit Secure Exam Client</w:t>
+      </w:r>
+    </w:p>
+    <w:p>
+      <w:pPr>
+        <w:spacing w:before="0" w:after="160"/>
+      </w:pPr>
+      <w:r>
+        <w:rPr>
+          <w:rFonts w:ascii="Carlito" w:hAnsi="Carlito"/>
+          <w:b w:val="0"/>
+          <w:i w:val="0"/>
+          <w:color w:val="000000"/>
+          <w:sz w:val="22"/>
+        </w:rPr>
+        <w:t xml:space="preserve">A dedicated desktop client, installed on examination machines, would provide the operating-system-level restrictions that a web application cannot. Proposed capabilities:</w:t>
       </w:r>
     </w:p>
     <w:p>
@@ -6394,18 +9221,19 @@
       </w:pPr>
       <w:r>
         <w:rPr>
-          <w:rFonts w:ascii="Carlito" w:hAnsi="Carlito"/>
-          <w:b/>
+          <w:b w:val="1"/>
+          <w:rFonts w:ascii="Carlito" w:hAnsi="Carlito"/>
           <w:sz w:val="22"/>
         </w:rPr>
-        <w:t>During the pilot</w:t>
-      </w:r>
-      <w:r>
-        <w:rPr>
+        <w:t xml:space="preserve">Windows kiosk mode</w:t>
+      </w:r>
+      <w:r>
+        <w:rPr>
+          <w:b w:val="0"/>
           <w:rFonts w:ascii="Carlito" w:hAnsi="Carlito"/>
           <w:sz w:val="22"/>
         </w:rPr>
-        <w:t xml:space="preserve"> — the authors maintain the platform, resolve issues, and support faculty at no cost to the institution.</w:t>
+        <w:t xml:space="preserve"> for the duration of an examination session.</w:t>
       </w:r>
     </w:p>
     <w:p>
@@ -6416,18 +9244,19 @@
       </w:pPr>
       <w:r>
         <w:rPr>
-          <w:rFonts w:ascii="Carlito" w:hAnsi="Carlito"/>
-          <w:b/>
+          <w:b w:val="1"/>
+          <w:rFonts w:ascii="Carlito" w:hAnsi="Carlito"/>
           <w:sz w:val="22"/>
         </w:rPr>
-        <w:t>Documentation handover</w:t>
-      </w:r>
-      <w:r>
-        <w:rPr>
+        <w:t xml:space="preserve">Stronger application restrictions</w:t>
+      </w:r>
+      <w:r>
+        <w:rPr>
+          <w:b w:val="0"/>
           <w:rFonts w:ascii="Carlito" w:hAnsi="Carlito"/>
           <w:sz w:val="22"/>
         </w:rPr>
-        <w:t xml:space="preserve"> — the source code, database schema, deployment guide, and administrator manual are handed to the Department of CSE, so the platform can be operated and modified without the authors.</w:t>
+        <w:t xml:space="preserve"> — controlling which applications may launch while an exam is in progress.</w:t>
       </w:r>
     </w:p>
     <w:p>
@@ -6438,18 +9267,19 @@
       </w:pPr>
       <w:r>
         <w:rPr>
-          <w:rFonts w:ascii="Carlito" w:hAnsi="Carlito"/>
-          <w:b/>
+          <w:b w:val="1"/>
+          <w:rFonts w:ascii="Carlito" w:hAnsi="Carlito"/>
           <w:sz w:val="22"/>
         </w:rPr>
-        <w:t>Built on standard, widely-taught technology</w:t>
-      </w:r>
-      <w:r>
-        <w:rPr>
+        <w:t xml:space="preserve">Controlled network access</w:t>
+      </w:r>
+      <w:r>
+        <w:rPr>
+          <w:b w:val="0"/>
           <w:rFonts w:ascii="Carlito" w:hAnsi="Carlito"/>
           <w:sz w:val="22"/>
         </w:rPr>
-        <w:t xml:space="preserve"> — Next.js, TypeScript, PostgreSQL, and Docker are mainstream tools. Any competent developer, including a final-year student under faculty supervision, can maintain the codebase.</w:t>
+        <w:t xml:space="preserve"> — restricting reachable destinations during an exam.</w:t>
       </w:r>
     </w:p>
     <w:p>
@@ -6460,18 +9290,19 @@
       </w:pPr>
       <w:r>
         <w:rPr>
-          <w:rFonts w:ascii="Carlito" w:hAnsi="Carlito"/>
-          <w:b/>
+          <w:b w:val="1"/>
+          <w:rFonts w:ascii="Carlito" w:hAnsi="Carlito"/>
           <w:sz w:val="22"/>
         </w:rPr>
-        <w:t>Continuity as a student project</w:t>
-      </w:r>
-      <w:r>
-        <w:rPr>
+        <w:t xml:space="preserve">Stronger OS-level exam lockdown</w:t>
+      </w:r>
+      <w:r>
+        <w:rPr>
+          <w:b w:val="0"/>
           <w:rFonts w:ascii="Carlito" w:hAnsi="Carlito"/>
           <w:sz w:val="22"/>
         </w:rPr>
-        <w:t xml:space="preserve"> — the platform is well suited to being carried forward by successive project batches under faculty guidance, which both sustains it and gives students real production experience.</w:t>
+        <w:t xml:space="preserve"> — closing the routes that browser-level monitoring can only observe.</w:t>
       </w:r>
     </w:p>
     <w:p>
@@ -6482,18 +9313,19 @@
       </w:pPr>
       <w:r>
         <w:rPr>
-          <w:rFonts w:ascii="Carlito" w:hAnsi="Carlito"/>
-          <w:b/>
+          <w:b w:val="1"/>
+          <w:rFonts w:ascii="Carlito" w:hAnsi="Carlito"/>
           <w:sz w:val="22"/>
         </w:rPr>
-        <w:t>No vendor lock-in</w:t>
-      </w:r>
-      <w:r>
-        <w:rPr>
+        <w:t xml:space="preserve">A controlled lab environment</w:t>
+      </w:r>
+      <w:r>
+        <w:rPr>
+          <w:b w:val="0"/>
           <w:rFonts w:ascii="Carlito" w:hAnsi="Carlito"/>
           <w:sz w:val="22"/>
         </w:rPr>
-        <w:t xml:space="preserve"> — nothing proprietary is used. Should the college choose to stop using LabSubmit, the data exports cleanly and no contract has to be exited.</w:t>
+        <w:t xml:space="preserve"> — a reproducible examination configuration rather than whatever state a machine happens to be in.</w:t>
       </w:r>
     </w:p>
     <w:p>
@@ -6504,20 +9336,167 @@
       </w:pPr>
       <w:r>
         <w:rPr>
+          <w:b w:val="1"/>
+          <w:rFonts w:ascii="Carlito" w:hAnsi="Carlito"/>
+          <w:sz w:val="22"/>
+        </w:rPr>
+        <w:t xml:space="preserve">Centralised deployment</w:t>
+      </w:r>
+      <w:r>
+        <w:rPr>
+          <w:b w:val="0"/>
+          <w:rFonts w:ascii="Carlito" w:hAnsi="Carlito"/>
+          <w:sz w:val="22"/>
+        </w:rPr>
+        <w:t xml:space="preserve"> — installation and configuration managed across institutional labs from one place.</w:t>
+      </w:r>
+    </w:p>
+    <w:p>
+      <w:pPr>
+        <w:spacing w:before="0" w:after="160"/>
+      </w:pPr>
+      <w:r>
+        <w:rPr>
+          <w:rFonts w:ascii="Carlito" w:hAnsi="Carlito"/>
+          <w:b w:val="0"/>
+          <w:i w:val="0"/>
+          <w:color w:val="000000"/>
+          <w:sz w:val="22"/>
+        </w:rPr>
+        <w:t xml:space="preserve">The client would continue to use the same server-authoritative exam session, the same integrity event store and the same faculty dashboard. Nothing built now would be discarded; the client would add a stronger enforcement layer beneath an unchanged model. It is not part of the twelve-month plan and no budget head in Section 15 depends on it.</w:t>
+      </w:r>
+    </w:p>
+    <w:p>
+      <w:pPr>
+        <w:spacing w:before="200" w:after="100"/>
+      </w:pPr>
+      <w:r>
+        <w:rPr>
           <w:rFonts w:ascii="Carlito" w:hAnsi="Carlito"/>
           <w:b/>
+          <w:i w:val="0"/>
+          <w:color w:val="1F3A5F"/>
+          <w:sz w:val="23"/>
+        </w:rPr>
+        <w:t xml:space="preserve">18.2 Other planned work</w:t>
+      </w:r>
+    </w:p>
+    <w:p>
+      <w:pPr>
+        <w:pStyle w:val="ListBullet"/>
+        <w:spacing w:after="80"/>
+        <w:ind w:left="425"/>
+      </w:pPr>
+      <w:r>
+        <w:rPr>
+          <w:b w:val="1"/>
+          <w:rFonts w:ascii="Carlito" w:hAnsi="Carlito"/>
           <w:sz w:val="22"/>
         </w:rPr>
-        <w:t>Institutional ownership</w:t>
-      </w:r>
-      <w:r>
-        <w:rPr>
+        <w:t xml:space="preserve">Per-student execution sandboxes</w:t>
+      </w:r>
+      <w:r>
+        <w:rPr>
+          <w:b w:val="0"/>
           <w:rFonts w:ascii="Carlito" w:hAnsi="Carlito"/>
           <w:sz w:val="22"/>
         </w:rPr>
-        <w:t xml:space="preserve"> — the authors are willing to transfer the codebase to CBIT outright, so the platform remains the department's asset regardless of who maintains it.</w:t>
+        <w:t xml:space="preserve"> — CPU, memory, process and time limits per execution, with an execution queue, replacing the present shared container.</w:t>
       </w:r>
     </w:p>
+    <w:p>
+      <w:pPr>
+        <w:pStyle w:val="ListBullet"/>
+        <w:spacing w:after="80"/>
+        <w:ind w:left="425"/>
+      </w:pPr>
+      <w:r>
+        <w:rPr>
+          <w:b w:val="1"/>
+          <w:rFonts w:ascii="Carlito" w:hAnsi="Carlito"/>
+          <w:sz w:val="22"/>
+        </w:rPr>
+        <w:t xml:space="preserve">A formal event severity model</w:t>
+      </w:r>
+      <w:r>
+        <w:rPr>
+          <w:b w:val="0"/>
+          <w:rFonts w:ascii="Carlito" w:hAnsi="Carlito"/>
+          <w:sz w:val="22"/>
+        </w:rPr>
+        <w:t xml:space="preserve"> — persisting the Low / Medium / High / Critical classification described in Section 8.3 and extending recording to clipboard, context-menu and duplicate-session events.</w:t>
+      </w:r>
+    </w:p>
+    <w:p>
+      <w:pPr>
+        <w:pStyle w:val="ListBullet"/>
+        <w:spacing w:after="80"/>
+        <w:ind w:left="425"/>
+      </w:pPr>
+      <w:r>
+        <w:rPr>
+          <w:b w:val="1"/>
+          <w:rFonts w:ascii="Carlito" w:hAnsi="Carlito"/>
+          <w:sz w:val="22"/>
+        </w:rPr>
+        <w:t xml:space="preserve">Randomised assessments</w:t>
+      </w:r>
+      <w:r>
+        <w:rPr>
+          <w:b w:val="0"/>
+          <w:rFonts w:ascii="Carlito" w:hAnsi="Carlito"/>
+          <w:sz w:val="22"/>
+        </w:rPr>
+        <w:t xml:space="preserve"> — variant problem statements and test data across a section, as an anti-collusion measure that reduces the value of copying in the first place.</w:t>
+      </w:r>
+    </w:p>
+    <w:p>
+      <w:pPr>
+        <w:pStyle w:val="ListBullet"/>
+        <w:spacing w:after="80"/>
+        <w:ind w:left="425"/>
+      </w:pPr>
+      <w:r>
+        <w:rPr>
+          <w:b w:val="1"/>
+          <w:rFonts w:ascii="Carlito" w:hAnsi="Carlito"/>
+          <w:sz w:val="22"/>
+        </w:rPr>
+        <w:t xml:space="preserve">Similarity detection</w:t>
+      </w:r>
+      <w:r>
+        <w:rPr>
+          <w:b w:val="0"/>
+          <w:rFonts w:ascii="Carlito" w:hAnsi="Carlito"/>
+          <w:sz w:val="22"/>
+        </w:rPr>
+        <w:t xml:space="preserve"> — structural comparison across a section, with AI-drafted explanations and remarks that faculty accept, edit or discard. No mark would be assigned automatically.</w:t>
+      </w:r>
+    </w:p>
+    <w:p>
+      <w:pPr>
+        <w:pStyle w:val="ListBullet"/>
+        <w:spacing w:after="80"/>
+        <w:ind w:left="425"/>
+      </w:pPr>
+      <w:r>
+        <w:rPr>
+          <w:b w:val="1"/>
+          <w:rFonts w:ascii="Carlito" w:hAnsi="Carlito"/>
+          <w:sz w:val="22"/>
+        </w:rPr>
+        <w:t xml:space="preserve">Batch tooling and exports</w:t>
+      </w:r>
+      <w:r>
+        <w:rPr>
+          <w:b w:val="0"/>
+          <w:rFonts w:ascii="Carlito" w:hAnsi="Carlito"/>
+          <w:sz w:val="22"/>
+        </w:rPr>
+        <w:t xml:space="preserve"> — reference solutions and test cases per exam, batch execution of a section, mark-sheet export and accreditation reports.</w:t>
+      </w:r>
+    </w:p>
+    <w:p/>
     <w:p>
       <w:pPr>
         <w:spacing w:before="280" w:after="120"/>
@@ -6530,7 +9509,7 @@
           <w:color w:val="1F3A5F"/>
           <w:sz w:val="26"/>
         </w:rPr>
-        <w:t>17. Conclusion</w:t>
+        <w:t xml:space="preserve">19. Maintenance, Support &amp; Continuity</w:t>
       </w:r>
     </w:p>
     <w:p>
@@ -6545,7 +9524,154 @@
           <w:color w:val="000000"/>
           <w:sz w:val="22"/>
         </w:rPr>
-        <w:t>LabSubmit is a working, deployable platform that directly addresses the operational gaps in how programming lab courses are currently run at CBIT — from roll-number-controlled registration through to live code execution, anti-cheat protected assessment, and structured grading. It has already been developed and is ready for a pilot deployment within the department.</w:t>
+        <w:t>A fair question about any student-built system is what happens when the student graduates. It is answered directly here rather than left for the committee to raise.</w:t>
+      </w:r>
+    </w:p>
+    <w:p>
+      <w:pPr>
+        <w:pStyle w:val="ListBullet"/>
+        <w:spacing w:after="80"/>
+        <w:ind w:left="425"/>
+      </w:pPr>
+      <w:r>
+        <w:rPr>
+          <w:rFonts w:ascii="Carlito" w:hAnsi="Carlito"/>
+          <w:b/>
+          <w:sz w:val="22"/>
+        </w:rPr>
+        <w:t>During the pilot</w:t>
+      </w:r>
+      <w:r>
+        <w:rPr>
+          <w:rFonts w:ascii="Carlito" w:hAnsi="Carlito"/>
+          <w:sz w:val="22"/>
+        </w:rPr>
+        <w:t xml:space="preserve"> — the authors maintain the platform, resolve issues, and support faculty at no cost to the institution.</w:t>
+      </w:r>
+    </w:p>
+    <w:p>
+      <w:pPr>
+        <w:pStyle w:val="ListBullet"/>
+        <w:spacing w:after="80"/>
+        <w:ind w:left="425"/>
+      </w:pPr>
+      <w:r>
+        <w:rPr>
+          <w:rFonts w:ascii="Carlito" w:hAnsi="Carlito"/>
+          <w:b/>
+          <w:sz w:val="22"/>
+        </w:rPr>
+        <w:t>Documentation handover</w:t>
+      </w:r>
+      <w:r>
+        <w:rPr>
+          <w:rFonts w:ascii="Carlito" w:hAnsi="Carlito"/>
+          <w:sz w:val="22"/>
+        </w:rPr>
+        <w:t xml:space="preserve"> — the source code, database schema, deployment guide, and administrator manual are handed to the Department of CSE, so the platform can be operated and modified without the authors.</w:t>
+      </w:r>
+    </w:p>
+    <w:p>
+      <w:pPr>
+        <w:pStyle w:val="ListBullet"/>
+        <w:spacing w:after="80"/>
+        <w:ind w:left="425"/>
+      </w:pPr>
+      <w:r>
+        <w:rPr>
+          <w:rFonts w:ascii="Carlito" w:hAnsi="Carlito"/>
+          <w:b/>
+          <w:sz w:val="22"/>
+        </w:rPr>
+        <w:t>Built on standard, widely-taught technology</w:t>
+      </w:r>
+      <w:r>
+        <w:rPr>
+          <w:rFonts w:ascii="Carlito" w:hAnsi="Carlito"/>
+          <w:sz w:val="22"/>
+        </w:rPr>
+        <w:t xml:space="preserve"> — Next.js, TypeScript, PostgreSQL, and Docker are mainstream tools. Any competent developer, including a final-year student under faculty supervision, can maintain the codebase.</w:t>
+      </w:r>
+    </w:p>
+    <w:p>
+      <w:pPr>
+        <w:pStyle w:val="ListBullet"/>
+        <w:spacing w:after="80"/>
+        <w:ind w:left="425"/>
+      </w:pPr>
+      <w:r>
+        <w:rPr>
+          <w:rFonts w:ascii="Carlito" w:hAnsi="Carlito"/>
+          <w:b/>
+          <w:sz w:val="22"/>
+        </w:rPr>
+        <w:t>Continuity as a student project</w:t>
+      </w:r>
+      <w:r>
+        <w:rPr>
+          <w:rFonts w:ascii="Carlito" w:hAnsi="Carlito"/>
+          <w:sz w:val="22"/>
+        </w:rPr>
+        <w:t xml:space="preserve"> — the platform is well suited to being carried forward by successive project batches under faculty guidance, which both sustains it and gives students real production experience.</w:t>
+      </w:r>
+    </w:p>
+    <w:p>
+      <w:pPr>
+        <w:pStyle w:val="ListBullet"/>
+        <w:spacing w:after="80"/>
+        <w:ind w:left="425"/>
+      </w:pPr>
+      <w:r>
+        <w:rPr>
+          <w:rFonts w:ascii="Carlito" w:hAnsi="Carlito"/>
+          <w:b/>
+          <w:sz w:val="22"/>
+        </w:rPr>
+        <w:t>No vendor lock-in</w:t>
+      </w:r>
+      <w:r>
+        <w:rPr>
+          <w:rFonts w:ascii="Carlito" w:hAnsi="Carlito"/>
+          <w:sz w:val="22"/>
+        </w:rPr>
+        <w:t xml:space="preserve"> — nothing proprietary is used. Should the college choose to stop using LabSubmit, the data exports cleanly and no contract has to be exited.</w:t>
+      </w:r>
+    </w:p>
+    <w:p>
+      <w:pPr>
+        <w:pStyle w:val="ListBullet"/>
+        <w:spacing w:after="80"/>
+        <w:ind w:left="425"/>
+      </w:pPr>
+      <w:r>
+        <w:rPr>
+          <w:rFonts w:ascii="Carlito" w:hAnsi="Carlito"/>
+          <w:b/>
+          <w:sz w:val="22"/>
+        </w:rPr>
+        <w:t>Institutional ownership</w:t>
+      </w:r>
+      <w:r>
+        <w:rPr>
+          <w:rFonts w:ascii="Carlito" w:hAnsi="Carlito"/>
+          <w:sz w:val="22"/>
+        </w:rPr>
+        <w:t xml:space="preserve"> — the authors are willing to transfer the codebase to CBIT outright, so the platform remains the department's asset regardless of who maintains it.</w:t>
+      </w:r>
+    </w:p>
+    <w:p>
+      <w:pPr>
+        <w:spacing w:before="280" w:after="120"/>
+      </w:pPr>
+      <w:r>
+        <w:rPr>
+          <w:rFonts w:ascii="Carlito" w:hAnsi="Carlito"/>
+          <w:b/>
+          <w:i w:val="0"/>
+          <w:color w:val="1F3A5F"/>
+          <w:sz w:val="26"/>
+        </w:rPr>
+        <w:t xml:space="preserve">20. Conclusion</w:t>
       </w:r>
     </w:p>
     <w:p>
@@ -6560,7 +9686,22 @@
           <w:color w:val="000000"/>
           <w:sz w:val="22"/>
         </w:rPr>
-        <w:t>This proposal requests the college's consideration to trial LabSubmit for an upcoming lab course as a step toward adopting it as the standard platform for programming laboratory management at CBIT.</w:t>
+        <w:t xml:space="preserve">LabSubmit is a working, deployable platform that addresses the operational gaps in how programming lab courses are currently run at CBIT — from roll-number-controlled registration through to live code execution and structured grading — and, with Secure Exam Mode, the integrity gaps that appear the moment a lab session becomes a graded examination. It does not merely conduct examinations online. It provides a controlled, auditable examination environment with server-authoritative exam sessions and browser-level Exam Integrity Monitoring, together with a clear and honestly stated path towards operating-system-level lockdown through a future Secure Exam Client.</w:t>
+      </w:r>
+    </w:p>
+    <w:p>
+      <w:pPr>
+        <w:spacing w:before="0" w:after="160"/>
+      </w:pPr>
+      <w:r>
+        <w:rPr>
+          <w:rFonts w:ascii="Carlito" w:hAnsi="Carlito"/>
+          <w:b w:val="0"/>
+          <w:i w:val="0"/>
+          <w:color w:val="000000"/>
+          <w:sz w:val="22"/>
+        </w:rPr>
+        <w:t xml:space="preserve">This proposal requests the college's consideration to trial LabSubmit for an upcoming lab course as a step towards adopting it as the standard platform for programming laboratory management and examination at CBIT.</w:t>
       </w:r>
     </w:p>
     <w:sectPr>

</xml_diff>